<commit_message>
consolidar archivo data 04102026
</commit_message>
<xml_diff>
--- a/docs/Diagnostic_report.docx
+++ b/docs/Diagnostic_report.docx
@@ -521,7 +521,7 @@
                     <pic:cNvPicPr preferRelativeResize="0"/>
                   </pic:nvPicPr>
                   <pic:blipFill>
-                    <a:blip r:embed="rId4"/>
+                    <a:blip r:embed="rId5"/>
                     <a:srcRect/>
                     <a:stretch>
                       <a:fillRect/>
@@ -1862,7 +1862,7 @@
     </w:p>
     <w:p>
       <w:pPr>
-        <w:spacing w:line="480" w:lineRule="auto"/>
+        <w:spacing w:line="360" w:lineRule="auto"/>
         <w:rPr>
           <w:rFonts w:ascii="Times New Roman" w:eastAsia="Arial" w:hAnsi="Times New Roman" w:cs="Times New Roman"/>
           <w:szCs w:val="22"/>
@@ -1871,7 +1871,7 @@
     </w:p>
     <w:p>
       <w:pPr>
-        <w:spacing w:line="480" w:lineRule="auto"/>
+        <w:spacing w:line="360" w:lineRule="auto"/>
         <w:rPr>
           <w:rFonts w:ascii="Times New Roman" w:eastAsia="Arial" w:hAnsi="Times New Roman" w:cs="Times New Roman"/>
           <w:szCs w:val="22"/>
@@ -2476,7 +2476,7 @@
     </w:p>
     <w:p>
       <w:pPr>
-        <w:spacing w:line="480" w:lineRule="auto"/>
+        <w:spacing w:line="360" w:lineRule="auto"/>
         <w:rPr>
           <w:rFonts w:ascii="Times New Roman" w:eastAsia="Arial" w:hAnsi="Times New Roman" w:cs="Times New Roman"/>
           <w:szCs w:val="22"/>
@@ -2485,7 +2485,7 @@
     </w:p>
     <w:p>
       <w:pPr>
-        <w:spacing w:line="480" w:lineRule="auto"/>
+        <w:spacing w:line="360" w:lineRule="auto"/>
         <w:rPr>
           <w:rFonts w:ascii="Times New Roman" w:eastAsia="Arial" w:hAnsi="Times New Roman" w:cs="Times New Roman"/>
           <w:szCs w:val="22"/>
@@ -2494,7 +2494,7 @@
     </w:p>
     <w:p>
       <w:pPr>
-        <w:spacing w:line="480" w:lineRule="auto"/>
+        <w:spacing w:line="360" w:lineRule="auto"/>
         <w:rPr>
           <w:rFonts w:ascii="Times New Roman" w:eastAsia="Arial" w:hAnsi="Times New Roman" w:cs="Times New Roman"/>
           <w:szCs w:val="22"/>
@@ -2503,7 +2503,7 @@
     </w:p>
     <w:p>
       <w:pPr>
-        <w:spacing w:line="480" w:lineRule="auto"/>
+        <w:spacing w:line="360" w:lineRule="auto"/>
         <w:rPr>
           <w:rFonts w:ascii="Times New Roman" w:eastAsia="Arial" w:hAnsi="Times New Roman" w:cs="Times New Roman"/>
           <w:szCs w:val="22"/>
@@ -2512,7 +2512,7 @@
     </w:p>
     <w:p>
       <w:pPr>
-        <w:spacing w:line="480" w:lineRule="auto"/>
+        <w:spacing w:line="360" w:lineRule="auto"/>
         <w:rPr>
           <w:rFonts w:ascii="Times New Roman" w:eastAsia="Arial" w:hAnsi="Times New Roman" w:cs="Times New Roman"/>
           <w:szCs w:val="22"/>
@@ -2521,14 +2521,16 @@
     </w:p>
     <w:p>
       <w:pPr>
-        <w:spacing w:line="480" w:lineRule="auto"/>
+        <w:spacing w:line="360" w:lineRule="auto"/>
         <w:ind w:left="0" w:firstLine="0"/>
         <w:rPr>
           <w:rFonts w:ascii="Times New Roman" w:eastAsia="Arial" w:hAnsi="Times New Roman" w:cs="Times New Roman"/>
+          <w:b/>
+          <w:bCs/>
           <w:szCs w:val="22"/>
         </w:rPr>
         <w:sectPr>
-          <w:footerReference w:type="default" r:id="rId5"/>
+          <w:footerReference w:type="default" r:id="rId6"/>
           <w:pgSz w:w="11900" w:h="16850"/>
           <w:pgMar w:top="620" w:right="720" w:bottom="280" w:left="1380" w:header="720" w:footer="720" w:gutter="0"/>
           <w:pgNumType w:start="1"/>
@@ -2536,7 +2538,3239 @@
         </w:sectPr>
       </w:pPr>
     </w:p>
-    <w:p/>
+    <w:p>
+      <w:pPr>
+        <w:spacing w:line="360" w:lineRule="auto"/>
+        <w:jc w:val="both"/>
+        <w:rPr>
+          <w:rFonts w:ascii="Times New Roman" w:hAnsi="Times New Roman" w:cs="Times New Roman"/>
+          <w:b/>
+          <w:bCs/>
+          <w:szCs w:val="22"/>
+        </w:rPr>
+      </w:pPr>
+      <w:r>
+        <w:rPr>
+          <w:rFonts w:ascii="Times New Roman" w:hAnsi="Times New Roman" w:cs="Times New Roman"/>
+          <w:b/>
+          <w:bCs/>
+          <w:color w:val="8A0000"/>
+          <w:szCs w:val="22"/>
+        </w:rPr>
+        <w:lastRenderedPageBreak/>
+        <w:t>Resumen</w:t>
+      </w:r>
+      <w:r>
+        <w:rPr>
+          <w:rFonts w:ascii="Times New Roman" w:hAnsi="Times New Roman" w:cs="Times New Roman"/>
+          <w:b/>
+          <w:bCs/>
+          <w:color w:val="8A0000"/>
+          <w:szCs w:val="22"/>
+        </w:rPr>
+        <w:t>:</w:t>
+      </w:r>
+    </w:p>
+    <w:p>
+      <w:pPr>
+        <w:spacing w:line="360" w:lineRule="auto"/>
+        <w:jc w:val="both"/>
+        <w:rPr>
+          <w:rFonts w:ascii="Times New Roman" w:hAnsi="Times New Roman" w:cs="Times New Roman"/>
+          <w:szCs w:val="22"/>
+        </w:rPr>
+      </w:pPr>
+      <w:r>
+        <w:rPr>
+          <w:rFonts w:ascii="Times New Roman" w:hAnsi="Times New Roman" w:cs="Times New Roman"/>
+          <w:szCs w:val="22"/>
+        </w:rPr>
+        <w:t xml:space="preserve">Basado en nuestro tema: </w:t>
+      </w:r>
+      <w:r>
+        <w:rPr>
+          <w:rFonts w:ascii="Times New Roman" w:hAnsi="Times New Roman" w:cs="Times New Roman"/>
+          <w:szCs w:val="22"/>
+        </w:rPr>
+        <w:t>Generación de los puntos más peligrosos de Ecuador para detectar zonas de riesgo para alertar a los turistas para que tomen precauciones usando modelos que puedan predecir los meses de mayores incidentes.</w:t>
+      </w:r>
+    </w:p>
+    <w:p>
+      <w:pPr>
+        <w:spacing w:line="360" w:lineRule="auto"/>
+        <w:jc w:val="both"/>
+        <w:rPr>
+          <w:rFonts w:ascii="Times New Roman" w:hAnsi="Times New Roman" w:cs="Times New Roman"/>
+        </w:rPr>
+      </w:pPr>
+      <w:r>
+        <w:rPr>
+          <w:rFonts w:ascii="Times New Roman" w:hAnsi="Times New Roman" w:cs="Times New Roman"/>
+        </w:rPr>
+        <w:t xml:space="preserve">El reporte técnico </w:t>
+      </w:r>
+      <w:r>
+        <w:rPr>
+          <w:rFonts w:ascii="Times New Roman" w:hAnsi="Times New Roman" w:cs="Times New Roman"/>
+        </w:rPr>
+        <w:t xml:space="preserve">analiza el comportamiento de overfitting y </w:t>
+      </w:r>
+      <w:proofErr w:type="spellStart"/>
+      <w:r>
+        <w:rPr>
+          <w:rFonts w:ascii="Times New Roman" w:hAnsi="Times New Roman" w:cs="Times New Roman"/>
+        </w:rPr>
+        <w:t>underfitting</w:t>
+      </w:r>
+      <w:proofErr w:type="spellEnd"/>
+      <w:r>
+        <w:rPr>
+          <w:rFonts w:ascii="Times New Roman" w:hAnsi="Times New Roman" w:cs="Times New Roman"/>
+        </w:rPr>
+        <w:t xml:space="preserve"> en los modelos de machine learning implementados para identificar zonas de riesgo en Ecuador y predecir los meses con mayor incidencia de incidentes. </w:t>
+      </w:r>
+    </w:p>
+    <w:p>
+      <w:pPr>
+        <w:spacing w:line="360" w:lineRule="auto"/>
+        <w:jc w:val="both"/>
+        <w:rPr>
+          <w:rFonts w:ascii="Times New Roman" w:hAnsi="Times New Roman" w:cs="Times New Roman"/>
+          <w:color w:val="8A0000"/>
+        </w:rPr>
+      </w:pPr>
+      <w:r>
+        <w:rPr>
+          <w:rFonts w:ascii="Times New Roman" w:hAnsi="Times New Roman" w:cs="Times New Roman"/>
+        </w:rPr>
+        <w:t>Se evaluaron tres modelos: K-Means (clustering), Random Forest y XGBoost (predicción supervisada).</w:t>
+      </w:r>
+    </w:p>
+    <w:p>
+      <w:pPr>
+        <w:numPr>
+          <w:ilvl w:val="0"/>
+          <w:numId w:val="1"/>
+        </w:numPr>
+        <w:spacing w:line="360" w:lineRule="auto"/>
+        <w:jc w:val="both"/>
+        <w:rPr>
+          <w:rFonts w:ascii="Times New Roman" w:hAnsi="Times New Roman" w:cs="Times New Roman"/>
+        </w:rPr>
+      </w:pPr>
+      <w:r>
+        <w:rPr>
+          <w:rFonts w:ascii="Times New Roman" w:hAnsi="Times New Roman" w:cs="Times New Roman"/>
+          <w:b/>
+          <w:bCs/>
+          <w:color w:val="8A0000"/>
+        </w:rPr>
+        <w:t>Random Forest</w:t>
+      </w:r>
+      <w:r>
+        <w:rPr>
+          <w:rFonts w:ascii="Times New Roman" w:hAnsi="Times New Roman" w:cs="Times New Roman"/>
+          <w:b/>
+          <w:bCs/>
+          <w:color w:val="8A0000"/>
+        </w:rPr>
+        <w:t>:</w:t>
+      </w:r>
+      <w:r>
+        <w:rPr>
+          <w:rFonts w:ascii="Times New Roman" w:hAnsi="Times New Roman" w:cs="Times New Roman"/>
+          <w:color w:val="8A0000"/>
+        </w:rPr>
+        <w:t xml:space="preserve"> </w:t>
+      </w:r>
+      <w:r>
+        <w:rPr>
+          <w:rFonts w:ascii="Times New Roman" w:hAnsi="Times New Roman" w:cs="Times New Roman"/>
+        </w:rPr>
+        <w:t xml:space="preserve">presenta tendencia a overfitting moderado (diferencia </w:t>
+      </w:r>
+      <w:proofErr w:type="spellStart"/>
+      <w:r>
+        <w:rPr>
+          <w:rFonts w:ascii="Times New Roman" w:hAnsi="Times New Roman" w:cs="Times New Roman"/>
+        </w:rPr>
+        <w:t>train</w:t>
+      </w:r>
+      <w:proofErr w:type="spellEnd"/>
+      <w:r>
+        <w:rPr>
+          <w:rFonts w:ascii="Times New Roman" w:hAnsi="Times New Roman" w:cs="Times New Roman"/>
+        </w:rPr>
+        <w:t>-test de 8-12%), mejorando con regularización y reducción de profundidad.</w:t>
+      </w:r>
+    </w:p>
+    <w:p>
+      <w:pPr>
+        <w:numPr>
+          <w:ilvl w:val="0"/>
+          <w:numId w:val="1"/>
+        </w:numPr>
+        <w:spacing w:line="360" w:lineRule="auto"/>
+        <w:jc w:val="both"/>
+        <w:rPr>
+          <w:rFonts w:ascii="Times New Roman" w:hAnsi="Times New Roman" w:cs="Times New Roman"/>
+        </w:rPr>
+      </w:pPr>
+      <w:r>
+        <w:rPr>
+          <w:rFonts w:ascii="Times New Roman" w:hAnsi="Times New Roman" w:cs="Times New Roman"/>
+          <w:b/>
+          <w:bCs/>
+          <w:color w:val="8A0000"/>
+        </w:rPr>
+        <w:t>XGBoost</w:t>
+      </w:r>
+      <w:r>
+        <w:rPr>
+          <w:rFonts w:ascii="Times New Roman" w:hAnsi="Times New Roman" w:cs="Times New Roman"/>
+          <w:b/>
+          <w:bCs/>
+          <w:color w:val="8A0000"/>
+        </w:rPr>
+        <w:t>:</w:t>
+      </w:r>
+      <w:r>
+        <w:rPr>
+          <w:rFonts w:ascii="Times New Roman" w:hAnsi="Times New Roman" w:cs="Times New Roman"/>
+          <w:color w:val="8A0000"/>
+        </w:rPr>
+        <w:t xml:space="preserve"> </w:t>
+      </w:r>
+      <w:r>
+        <w:rPr>
+          <w:rFonts w:ascii="Times New Roman" w:hAnsi="Times New Roman" w:cs="Times New Roman"/>
+        </w:rPr>
+        <w:t xml:space="preserve">muestra </w:t>
+      </w:r>
+      <w:r>
+        <w:rPr>
+          <w:rFonts w:ascii="Times New Roman" w:hAnsi="Times New Roman" w:cs="Times New Roman"/>
+        </w:rPr>
+        <w:t>balance óptimo</w:t>
+      </w:r>
+      <w:r>
+        <w:rPr>
+          <w:rFonts w:ascii="Times New Roman" w:hAnsi="Times New Roman" w:cs="Times New Roman"/>
+        </w:rPr>
+        <w:t xml:space="preserve"> con menor overfitting gracias a su regularización incorporada y </w:t>
+      </w:r>
+      <w:proofErr w:type="spellStart"/>
+      <w:r>
+        <w:rPr>
+          <w:rFonts w:ascii="Times New Roman" w:hAnsi="Times New Roman" w:cs="Times New Roman"/>
+        </w:rPr>
+        <w:t>early</w:t>
+      </w:r>
+      <w:proofErr w:type="spellEnd"/>
+      <w:r>
+        <w:rPr>
+          <w:rFonts w:ascii="Times New Roman" w:hAnsi="Times New Roman" w:cs="Times New Roman"/>
+        </w:rPr>
+        <w:t xml:space="preserve"> </w:t>
+      </w:r>
+      <w:proofErr w:type="spellStart"/>
+      <w:r>
+        <w:rPr>
+          <w:rFonts w:ascii="Times New Roman" w:hAnsi="Times New Roman" w:cs="Times New Roman"/>
+        </w:rPr>
+        <w:t>stopping</w:t>
+      </w:r>
+      <w:proofErr w:type="spellEnd"/>
+      <w:r>
+        <w:rPr>
+          <w:rFonts w:ascii="Times New Roman" w:hAnsi="Times New Roman" w:cs="Times New Roman"/>
+        </w:rPr>
+        <w:t>.</w:t>
+      </w:r>
+    </w:p>
+    <w:p>
+      <w:pPr>
+        <w:numPr>
+          <w:ilvl w:val="0"/>
+          <w:numId w:val="1"/>
+        </w:numPr>
+        <w:spacing w:line="360" w:lineRule="auto"/>
+        <w:jc w:val="both"/>
+        <w:rPr>
+          <w:rFonts w:ascii="Times New Roman" w:hAnsi="Times New Roman" w:cs="Times New Roman"/>
+        </w:rPr>
+      </w:pPr>
+      <w:r>
+        <w:rPr>
+          <w:rFonts w:ascii="Times New Roman" w:hAnsi="Times New Roman" w:cs="Times New Roman"/>
+          <w:b/>
+          <w:bCs/>
+          <w:color w:val="8A0000"/>
+        </w:rPr>
+        <w:t>K-Means</w:t>
+      </w:r>
+      <w:r>
+        <w:rPr>
+          <w:rFonts w:ascii="Times New Roman" w:hAnsi="Times New Roman" w:cs="Times New Roman"/>
+          <w:b/>
+          <w:bCs/>
+          <w:color w:val="8A0000"/>
+        </w:rPr>
+        <w:t>:</w:t>
+      </w:r>
+      <w:r>
+        <w:rPr>
+          <w:rFonts w:ascii="Times New Roman" w:hAnsi="Times New Roman" w:cs="Times New Roman"/>
+          <w:color w:val="8A0000"/>
+        </w:rPr>
+        <w:t xml:space="preserve"> </w:t>
+      </w:r>
+      <w:r>
+        <w:rPr>
+          <w:rFonts w:ascii="Times New Roman" w:hAnsi="Times New Roman" w:cs="Times New Roman"/>
+        </w:rPr>
+        <w:t>no presenta overfitting/</w:t>
+      </w:r>
+      <w:proofErr w:type="spellStart"/>
+      <w:r>
+        <w:rPr>
+          <w:rFonts w:ascii="Times New Roman" w:hAnsi="Times New Roman" w:cs="Times New Roman"/>
+        </w:rPr>
+        <w:t>underfitting</w:t>
+      </w:r>
+      <w:proofErr w:type="spellEnd"/>
+      <w:r>
+        <w:rPr>
+          <w:rFonts w:ascii="Times New Roman" w:hAnsi="Times New Roman" w:cs="Times New Roman"/>
+        </w:rPr>
+        <w:t xml:space="preserve"> (algoritmo no supervisado), pero requiere validación de número de </w:t>
+      </w:r>
+      <w:r>
+        <w:rPr>
+          <w:rFonts w:ascii="Times New Roman" w:hAnsi="Times New Roman" w:cs="Times New Roman"/>
+        </w:rPr>
+        <w:t>clústeres</w:t>
+      </w:r>
+      <w:r>
+        <w:rPr>
+          <w:rFonts w:ascii="Times New Roman" w:hAnsi="Times New Roman" w:cs="Times New Roman"/>
+        </w:rPr>
+        <w:t>.</w:t>
+      </w:r>
+    </w:p>
+    <w:p>
+      <w:pPr>
+        <w:spacing w:line="360" w:lineRule="auto"/>
+        <w:jc w:val="both"/>
+        <w:rPr>
+          <w:rFonts w:ascii="Times New Roman" w:hAnsi="Times New Roman" w:cs="Times New Roman"/>
+        </w:rPr>
+      </w:pPr>
+      <w:r>
+        <w:rPr>
+          <w:rFonts w:ascii="Times New Roman" w:hAnsi="Times New Roman" w:cs="Times New Roman"/>
+        </w:rPr>
+        <w:t xml:space="preserve">Hemos analizado tomando </w:t>
+      </w:r>
+      <w:r>
+        <w:rPr>
+          <w:rFonts w:ascii="Times New Roman" w:hAnsi="Times New Roman" w:cs="Times New Roman"/>
+        </w:rPr>
+        <w:t>en</w:t>
+      </w:r>
+      <w:r>
+        <w:rPr>
+          <w:rFonts w:ascii="Times New Roman" w:hAnsi="Times New Roman" w:cs="Times New Roman"/>
+        </w:rPr>
+        <w:t xml:space="preserve"> cuenta la</w:t>
+      </w:r>
+      <w:r>
+        <w:rPr>
+          <w:rFonts w:ascii="Times New Roman" w:hAnsi="Times New Roman" w:cs="Times New Roman"/>
+        </w:rPr>
+        <w:t xml:space="preserve"> </w:t>
+      </w:r>
+      <w:r>
+        <w:rPr>
+          <w:rFonts w:ascii="Times New Roman" w:hAnsi="Times New Roman" w:cs="Times New Roman"/>
+        </w:rPr>
+        <w:t>i</w:t>
+      </w:r>
+      <w:r>
+        <w:rPr>
+          <w:rFonts w:ascii="Times New Roman" w:hAnsi="Times New Roman" w:cs="Times New Roman"/>
+        </w:rPr>
+        <w:t>mplementa</w:t>
+      </w:r>
+      <w:r>
+        <w:rPr>
+          <w:rFonts w:ascii="Times New Roman" w:hAnsi="Times New Roman" w:cs="Times New Roman"/>
+        </w:rPr>
+        <w:t>ción</w:t>
+      </w:r>
+      <w:r>
+        <w:rPr>
+          <w:rFonts w:ascii="Times New Roman" w:hAnsi="Times New Roman" w:cs="Times New Roman"/>
+        </w:rPr>
+        <w:t xml:space="preserve"> XGBoost como modelo principal con validación cruzada 5-fold y </w:t>
+      </w:r>
+      <w:proofErr w:type="spellStart"/>
+      <w:r>
+        <w:rPr>
+          <w:rFonts w:ascii="Times New Roman" w:hAnsi="Times New Roman" w:cs="Times New Roman"/>
+        </w:rPr>
+        <w:t>early</w:t>
+      </w:r>
+      <w:proofErr w:type="spellEnd"/>
+      <w:r>
+        <w:rPr>
+          <w:rFonts w:ascii="Times New Roman" w:hAnsi="Times New Roman" w:cs="Times New Roman"/>
+        </w:rPr>
+        <w:t xml:space="preserve"> </w:t>
+      </w:r>
+      <w:proofErr w:type="spellStart"/>
+      <w:r>
+        <w:rPr>
+          <w:rFonts w:ascii="Times New Roman" w:hAnsi="Times New Roman" w:cs="Times New Roman"/>
+        </w:rPr>
+        <w:t>stopping</w:t>
+      </w:r>
+      <w:proofErr w:type="spellEnd"/>
+      <w:r>
+        <w:rPr>
+          <w:rFonts w:ascii="Times New Roman" w:hAnsi="Times New Roman" w:cs="Times New Roman"/>
+        </w:rPr>
+        <w:t xml:space="preserve">. </w:t>
+      </w:r>
+    </w:p>
+    <w:p>
+      <w:pPr>
+        <w:spacing w:line="360" w:lineRule="auto"/>
+        <w:jc w:val="both"/>
+        <w:rPr>
+          <w:rFonts w:ascii="Times New Roman" w:hAnsi="Times New Roman" w:cs="Times New Roman"/>
+        </w:rPr>
+      </w:pPr>
+      <w:r>
+        <w:rPr>
+          <w:rFonts w:ascii="Times New Roman" w:hAnsi="Times New Roman" w:cs="Times New Roman"/>
+        </w:rPr>
+        <w:t>Complementa</w:t>
+      </w:r>
+      <w:r>
+        <w:rPr>
+          <w:rFonts w:ascii="Times New Roman" w:hAnsi="Times New Roman" w:cs="Times New Roman"/>
+        </w:rPr>
+        <w:t>mos</w:t>
+      </w:r>
+      <w:r>
+        <w:rPr>
+          <w:rFonts w:ascii="Times New Roman" w:hAnsi="Times New Roman" w:cs="Times New Roman"/>
+        </w:rPr>
+        <w:t xml:space="preserve"> con Random Forest regularizado para interpretabilidad. Ambos modelos alcanzan F1-Score ≥ 0.78, superando el </w:t>
+      </w:r>
+      <w:proofErr w:type="gramStart"/>
+      <w:r>
+        <w:rPr>
+          <w:rFonts w:ascii="Times New Roman" w:hAnsi="Times New Roman" w:cs="Times New Roman"/>
+        </w:rPr>
+        <w:t>target</w:t>
+      </w:r>
+      <w:proofErr w:type="gramEnd"/>
+      <w:r>
+        <w:rPr>
+          <w:rFonts w:ascii="Times New Roman" w:hAnsi="Times New Roman" w:cs="Times New Roman"/>
+        </w:rPr>
+        <w:t xml:space="preserve"> de</w:t>
+      </w:r>
+      <w:r>
+        <w:rPr>
+          <w:rFonts w:ascii="Times New Roman" w:hAnsi="Times New Roman" w:cs="Times New Roman"/>
+        </w:rPr>
+        <w:t xml:space="preserve"> </w:t>
+      </w:r>
+      <w:r>
+        <w:rPr>
+          <w:rFonts w:ascii="Times New Roman" w:hAnsi="Times New Roman" w:cs="Times New Roman"/>
+        </w:rPr>
+        <w:t>l</w:t>
+      </w:r>
+      <w:r>
+        <w:rPr>
+          <w:rFonts w:ascii="Times New Roman" w:hAnsi="Times New Roman" w:cs="Times New Roman"/>
+        </w:rPr>
+        <w:t>o desea en el</w:t>
+      </w:r>
+      <w:r>
+        <w:rPr>
+          <w:rFonts w:ascii="Times New Roman" w:hAnsi="Times New Roman" w:cs="Times New Roman"/>
+        </w:rPr>
+        <w:t xml:space="preserve"> proyecto (0.78).</w:t>
+      </w:r>
+    </w:p>
+    <w:p>
+      <w:pPr>
+        <w:spacing w:line="360" w:lineRule="auto"/>
+        <w:jc w:val="both"/>
+        <w:rPr>
+          <w:rFonts w:ascii="Times New Roman" w:hAnsi="Times New Roman" w:cs="Times New Roman"/>
+        </w:rPr>
+      </w:pPr>
+      <w:r>
+        <w:rPr>
+          <w:rFonts w:ascii="Times New Roman" w:hAnsi="Times New Roman" w:cs="Times New Roman"/>
+        </w:rPr>
+        <w:t xml:space="preserve">Hemos generado </w:t>
+      </w:r>
+      <w:r>
+        <w:rPr>
+          <w:rFonts w:ascii="Times New Roman" w:hAnsi="Times New Roman" w:cs="Times New Roman"/>
+        </w:rPr>
+        <w:t>clústeres</w:t>
+      </w:r>
+      <w:r>
+        <w:rPr>
+          <w:rFonts w:ascii="Times New Roman" w:hAnsi="Times New Roman" w:cs="Times New Roman"/>
+        </w:rPr>
+        <w:t xml:space="preserve"> para que nos ayude a organizar los datos sin necesidad de etiquetas previas, facilitando en análisis exploratorio</w:t>
+      </w:r>
+      <w:r>
+        <w:rPr>
+          <w:rFonts w:ascii="Times New Roman" w:hAnsi="Times New Roman" w:cs="Times New Roman"/>
+        </w:rPr>
+        <w:t xml:space="preserve"> dividiendo grandes volúmenes de datos en segmentos más manejables como es nuestro caso donde arrancamos con una data de más de 17 millones de datos</w:t>
+      </w:r>
+      <w:r>
+        <w:rPr>
+          <w:rFonts w:ascii="Times New Roman" w:hAnsi="Times New Roman" w:cs="Times New Roman"/>
+        </w:rPr>
+        <w:t>, se consideró que los datos tuvieron que pasar por una limpieza de datos que incluyo eliminar aquellas columnas que no ejercían beneficio porque estaban creadas pero vacías así como registros que la mayoría de sus datos o los más relevante se encuentra nulos</w:t>
+      </w:r>
+      <w:r>
+        <w:rPr>
+          <w:rFonts w:ascii="Times New Roman" w:hAnsi="Times New Roman" w:cs="Times New Roman"/>
+        </w:rPr>
+        <w:t>.</w:t>
+      </w:r>
+    </w:p>
+    <w:p>
+      <w:pPr>
+        <w:spacing w:line="360" w:lineRule="auto"/>
+        <w:jc w:val="both"/>
+        <w:rPr>
+          <w:rFonts w:ascii="Times New Roman" w:hAnsi="Times New Roman" w:cs="Times New Roman"/>
+        </w:rPr>
+      </w:pPr>
+      <w:r>
+        <w:rPr>
+          <w:rFonts w:ascii="Times New Roman" w:hAnsi="Times New Roman" w:cs="Times New Roman"/>
+        </w:rPr>
+        <w:t>El algoritmo ajusta los centroides hasta minimizar la distancia interna de cada cl</w:t>
+      </w:r>
+      <w:r>
+        <w:rPr>
+          <w:rFonts w:ascii="Times New Roman" w:hAnsi="Times New Roman" w:cs="Times New Roman"/>
+        </w:rPr>
+        <w:t>ú</w:t>
+      </w:r>
+      <w:r>
+        <w:rPr>
+          <w:rFonts w:ascii="Times New Roman" w:hAnsi="Times New Roman" w:cs="Times New Roman"/>
+        </w:rPr>
+        <w:t>ster</w:t>
+      </w:r>
+      <w:r>
+        <w:rPr>
+          <w:rFonts w:ascii="Times New Roman" w:hAnsi="Times New Roman" w:cs="Times New Roman"/>
+        </w:rPr>
+        <w:t>.</w:t>
+      </w:r>
+    </w:p>
+    <w:p>
+      <w:pPr>
+        <w:spacing w:line="360" w:lineRule="auto"/>
+        <w:jc w:val="both"/>
+        <w:rPr>
+          <w:rFonts w:ascii="Times New Roman" w:hAnsi="Times New Roman" w:cs="Times New Roman"/>
+        </w:rPr>
+      </w:pPr>
+    </w:p>
+    <w:p>
+      <w:pPr>
+        <w:spacing w:line="360" w:lineRule="auto"/>
+      </w:pPr>
+    </w:p>
+    <w:p>
+      <w:pPr>
+        <w:spacing w:line="360" w:lineRule="auto"/>
+      </w:pPr>
+    </w:p>
+    <w:p>
+      <w:pPr>
+        <w:spacing w:line="360" w:lineRule="auto"/>
+        <w:ind w:left="0" w:firstLine="0"/>
+      </w:pPr>
+    </w:p>
+    <w:p>
+      <w:pPr>
+        <w:spacing w:line="360" w:lineRule="auto"/>
+        <w:ind w:left="0" w:firstLine="0"/>
+        <w:rPr>
+          <w:b/>
+          <w:bCs/>
+          <w:color w:val="8A0000"/>
+          <w:u w:val="single"/>
+        </w:rPr>
+      </w:pPr>
+      <w:r>
+        <w:rPr>
+          <w:b/>
+          <w:bCs/>
+          <w:color w:val="8A0000"/>
+          <w:u w:val="single"/>
+        </w:rPr>
+        <w:lastRenderedPageBreak/>
+        <w:t xml:space="preserve">Metodología: </w:t>
+      </w:r>
+    </w:p>
+    <w:p>
+      <w:pPr>
+        <w:spacing w:line="360" w:lineRule="auto"/>
+      </w:pPr>
+      <w:r>
+        <w:t>La metodología contemplo los siguientes puntos:</w:t>
+      </w:r>
+    </w:p>
+    <w:p>
+      <w:pPr>
+        <w:pStyle w:val="Prrafodelista"/>
+        <w:numPr>
+          <w:ilvl w:val="0"/>
+          <w:numId w:val="2"/>
+        </w:numPr>
+        <w:spacing w:line="360" w:lineRule="auto"/>
+        <w:rPr>
+          <w:b/>
+          <w:bCs/>
+          <w:color w:val="8A0000"/>
+        </w:rPr>
+      </w:pPr>
+      <w:r>
+        <w:rPr>
+          <w:b/>
+          <w:bCs/>
+          <w:color w:val="8A0000"/>
+        </w:rPr>
+        <w:t>Descripción de los datos</w:t>
+      </w:r>
+    </w:p>
+    <w:tbl>
+      <w:tblPr>
+        <w:tblW w:w="0" w:type="dxa"/>
+        <w:tblCellSpacing w:w="15" w:type="dxa"/>
+        <w:tblBorders>
+          <w:top w:val="single" w:sz="4" w:space="0" w:color="auto"/>
+          <w:left w:val="single" w:sz="4" w:space="0" w:color="auto"/>
+          <w:bottom w:val="single" w:sz="4" w:space="0" w:color="auto"/>
+          <w:right w:val="single" w:sz="4" w:space="0" w:color="auto"/>
+          <w:insideH w:val="single" w:sz="4" w:space="0" w:color="auto"/>
+          <w:insideV w:val="single" w:sz="4" w:space="0" w:color="auto"/>
+        </w:tblBorders>
+        <w:shd w:val="clear" w:color="auto" w:fill="FFFFFF"/>
+        <w:tblCellMar>
+          <w:top w:w="15" w:type="dxa"/>
+          <w:left w:w="15" w:type="dxa"/>
+          <w:bottom w:w="15" w:type="dxa"/>
+          <w:right w:w="15" w:type="dxa"/>
+        </w:tblCellMar>
+        <w:tblLook w:val="04A0" w:firstRow="1" w:lastRow="0" w:firstColumn="1" w:lastColumn="0" w:noHBand="0" w:noVBand="1"/>
+      </w:tblPr>
+      <w:tblGrid>
+        <w:gridCol w:w="2260"/>
+        <w:gridCol w:w="6234"/>
+      </w:tblGrid>
+      <w:tr>
+        <w:trPr>
+          <w:tblHeader/>
+          <w:tblCellSpacing w:w="15" w:type="dxa"/>
+        </w:trPr>
+        <w:tc>
+          <w:tcPr>
+            <w:tcW w:w="0" w:type="auto"/>
+            <w:shd w:val="clear" w:color="auto" w:fill="F6F8FA"/>
+            <w:tcMar>
+              <w:top w:w="90" w:type="dxa"/>
+              <w:left w:w="120" w:type="dxa"/>
+              <w:bottom w:w="90" w:type="dxa"/>
+              <w:right w:w="120" w:type="dxa"/>
+            </w:tcMar>
+            <w:vAlign w:val="center"/>
+            <w:hideMark/>
+          </w:tcPr>
+          <w:p>
+            <w:pPr>
+              <w:spacing w:line="360" w:lineRule="auto"/>
+              <w:rPr>
+                <w:color w:val="8A0000"/>
+              </w:rPr>
+            </w:pPr>
+            <w:r>
+              <w:rPr>
+                <w:color w:val="8A0000"/>
+              </w:rPr>
+              <w:t>Aspecto</w:t>
+            </w:r>
+          </w:p>
+        </w:tc>
+        <w:tc>
+          <w:tcPr>
+            <w:tcW w:w="0" w:type="auto"/>
+            <w:shd w:val="clear" w:color="auto" w:fill="F6F8FA"/>
+            <w:tcMar>
+              <w:top w:w="90" w:type="dxa"/>
+              <w:left w:w="120" w:type="dxa"/>
+              <w:bottom w:w="90" w:type="dxa"/>
+              <w:right w:w="120" w:type="dxa"/>
+            </w:tcMar>
+            <w:vAlign w:val="center"/>
+            <w:hideMark/>
+          </w:tcPr>
+          <w:p>
+            <w:pPr>
+              <w:spacing w:line="360" w:lineRule="auto"/>
+              <w:rPr>
+                <w:color w:val="8A0000"/>
+              </w:rPr>
+            </w:pPr>
+            <w:r>
+              <w:rPr>
+                <w:color w:val="8A0000"/>
+              </w:rPr>
+              <w:t>Detalles</w:t>
+            </w:r>
+          </w:p>
+        </w:tc>
+      </w:tr>
+      <w:tr>
+        <w:trPr>
+          <w:tblCellSpacing w:w="15" w:type="dxa"/>
+        </w:trPr>
+        <w:tc>
+          <w:tcPr>
+            <w:tcW w:w="0" w:type="auto"/>
+            <w:shd w:val="clear" w:color="auto" w:fill="FFFFFF"/>
+            <w:tcMar>
+              <w:top w:w="90" w:type="dxa"/>
+              <w:left w:w="120" w:type="dxa"/>
+              <w:bottom w:w="90" w:type="dxa"/>
+              <w:right w:w="120" w:type="dxa"/>
+            </w:tcMar>
+            <w:vAlign w:val="center"/>
+            <w:hideMark/>
+          </w:tcPr>
+          <w:p>
+            <w:pPr>
+              <w:spacing w:line="360" w:lineRule="auto"/>
+              <w:rPr>
+                <w:color w:val="8A0000"/>
+              </w:rPr>
+            </w:pPr>
+            <w:r>
+              <w:rPr>
+                <w:color w:val="8A0000"/>
+              </w:rPr>
+              <w:t>Fuente</w:t>
+            </w:r>
+          </w:p>
+        </w:tc>
+        <w:tc>
+          <w:tcPr>
+            <w:tcW w:w="0" w:type="auto"/>
+            <w:shd w:val="clear" w:color="auto" w:fill="FFFFFF"/>
+            <w:tcMar>
+              <w:top w:w="90" w:type="dxa"/>
+              <w:left w:w="120" w:type="dxa"/>
+              <w:bottom w:w="90" w:type="dxa"/>
+              <w:right w:w="120" w:type="dxa"/>
+            </w:tcMar>
+            <w:vAlign w:val="center"/>
+            <w:hideMark/>
+          </w:tcPr>
+          <w:p>
+            <w:pPr>
+              <w:spacing w:line="360" w:lineRule="auto"/>
+            </w:pPr>
+            <w:r>
+              <w:t>Registros históricos de incidentes de seguridad en Ecuador (202</w:t>
+            </w:r>
+            <w:r>
+              <w:t>1</w:t>
+            </w:r>
+            <w:r>
+              <w:t>-202</w:t>
+            </w:r>
+            <w:r>
+              <w:t>6</w:t>
+            </w:r>
+            <w:r>
+              <w:t>)</w:t>
+            </w:r>
+          </w:p>
+        </w:tc>
+      </w:tr>
+      <w:tr>
+        <w:trPr>
+          <w:tblCellSpacing w:w="15" w:type="dxa"/>
+        </w:trPr>
+        <w:tc>
+          <w:tcPr>
+            <w:tcW w:w="0" w:type="auto"/>
+            <w:shd w:val="clear" w:color="auto" w:fill="F6F8FA"/>
+            <w:tcMar>
+              <w:top w:w="90" w:type="dxa"/>
+              <w:left w:w="120" w:type="dxa"/>
+              <w:bottom w:w="90" w:type="dxa"/>
+              <w:right w:w="120" w:type="dxa"/>
+            </w:tcMar>
+            <w:vAlign w:val="center"/>
+            <w:hideMark/>
+          </w:tcPr>
+          <w:p>
+            <w:pPr>
+              <w:spacing w:line="360" w:lineRule="auto"/>
+              <w:rPr>
+                <w:color w:val="8A0000"/>
+              </w:rPr>
+            </w:pPr>
+            <w:r>
+              <w:rPr>
+                <w:color w:val="8A0000"/>
+              </w:rPr>
+              <w:t>Tamaño total</w:t>
+            </w:r>
+          </w:p>
+        </w:tc>
+        <w:tc>
+          <w:tcPr>
+            <w:tcW w:w="0" w:type="auto"/>
+            <w:shd w:val="clear" w:color="auto" w:fill="F6F8FA"/>
+            <w:tcMar>
+              <w:top w:w="90" w:type="dxa"/>
+              <w:left w:w="120" w:type="dxa"/>
+              <w:bottom w:w="90" w:type="dxa"/>
+              <w:right w:w="120" w:type="dxa"/>
+            </w:tcMar>
+            <w:vAlign w:val="center"/>
+            <w:hideMark/>
+          </w:tcPr>
+          <w:p>
+            <w:pPr>
+              <w:spacing w:line="360" w:lineRule="auto"/>
+            </w:pPr>
+            <w:r>
+              <w:t>17680253</w:t>
+            </w:r>
+            <w:r>
+              <w:t xml:space="preserve"> registros</w:t>
+            </w:r>
+          </w:p>
+        </w:tc>
+      </w:tr>
+      <w:tr>
+        <w:trPr>
+          <w:tblCellSpacing w:w="15" w:type="dxa"/>
+        </w:trPr>
+        <w:tc>
+          <w:tcPr>
+            <w:tcW w:w="0" w:type="auto"/>
+            <w:shd w:val="clear" w:color="auto" w:fill="FFFFFF"/>
+            <w:tcMar>
+              <w:top w:w="90" w:type="dxa"/>
+              <w:left w:w="120" w:type="dxa"/>
+              <w:bottom w:w="90" w:type="dxa"/>
+              <w:right w:w="120" w:type="dxa"/>
+            </w:tcMar>
+            <w:vAlign w:val="center"/>
+            <w:hideMark/>
+          </w:tcPr>
+          <w:p>
+            <w:pPr>
+              <w:spacing w:line="360" w:lineRule="auto"/>
+              <w:rPr>
+                <w:color w:val="8A0000"/>
+              </w:rPr>
+            </w:pPr>
+            <w:r>
+              <w:rPr>
+                <w:color w:val="8A0000"/>
+              </w:rPr>
+              <w:t>Características</w:t>
+            </w:r>
+          </w:p>
+        </w:tc>
+        <w:tc>
+          <w:tcPr>
+            <w:tcW w:w="0" w:type="auto"/>
+            <w:shd w:val="clear" w:color="auto" w:fill="FFFFFF"/>
+            <w:tcMar>
+              <w:top w:w="90" w:type="dxa"/>
+              <w:left w:w="120" w:type="dxa"/>
+              <w:bottom w:w="90" w:type="dxa"/>
+              <w:right w:w="120" w:type="dxa"/>
+            </w:tcMar>
+            <w:vAlign w:val="center"/>
+            <w:hideMark/>
+          </w:tcPr>
+          <w:p>
+            <w:pPr>
+              <w:spacing w:line="360" w:lineRule="auto"/>
+            </w:pPr>
+            <w:r>
+              <w:t xml:space="preserve">Fecha, provincia, cantón, parroquia, </w:t>
+            </w:r>
+            <w:r>
+              <w:t>Servicio(</w:t>
+            </w:r>
+            <w:r>
+              <w:t>tipo de incidente</w:t>
+            </w:r>
+            <w:r>
+              <w:t>)</w:t>
+            </w:r>
+            <w:r>
+              <w:t>,</w:t>
+            </w:r>
+            <w:r>
+              <w:t xml:space="preserve"> subtipo(</w:t>
+            </w:r>
+            <w:r>
+              <w:t>clasificación de riesgo</w:t>
+            </w:r>
+            <w:r>
+              <w:t>)</w:t>
+            </w:r>
+          </w:p>
+        </w:tc>
+      </w:tr>
+      <w:tr>
+        <w:trPr>
+          <w:tblCellSpacing w:w="15" w:type="dxa"/>
+        </w:trPr>
+        <w:tc>
+          <w:tcPr>
+            <w:tcW w:w="0" w:type="auto"/>
+            <w:shd w:val="clear" w:color="auto" w:fill="F6F8FA"/>
+            <w:tcMar>
+              <w:top w:w="90" w:type="dxa"/>
+              <w:left w:w="120" w:type="dxa"/>
+              <w:bottom w:w="90" w:type="dxa"/>
+              <w:right w:w="120" w:type="dxa"/>
+            </w:tcMar>
+            <w:vAlign w:val="center"/>
+            <w:hideMark/>
+          </w:tcPr>
+          <w:p>
+            <w:pPr>
+              <w:spacing w:line="360" w:lineRule="auto"/>
+              <w:rPr>
+                <w:color w:val="8A0000"/>
+              </w:rPr>
+            </w:pPr>
+            <w:r>
+              <w:rPr>
+                <w:color w:val="8A0000"/>
+              </w:rPr>
+              <w:t>Variable objetivo</w:t>
+            </w:r>
+          </w:p>
+        </w:tc>
+        <w:tc>
+          <w:tcPr>
+            <w:tcW w:w="0" w:type="auto"/>
+            <w:shd w:val="clear" w:color="auto" w:fill="F6F8FA"/>
+            <w:tcMar>
+              <w:top w:w="90" w:type="dxa"/>
+              <w:left w:w="120" w:type="dxa"/>
+              <w:bottom w:w="90" w:type="dxa"/>
+              <w:right w:w="120" w:type="dxa"/>
+            </w:tcMar>
+            <w:vAlign w:val="center"/>
+            <w:hideMark/>
+          </w:tcPr>
+          <w:p>
+            <w:pPr>
+              <w:spacing w:line="360" w:lineRule="auto"/>
+            </w:pPr>
+            <w:r>
+              <w:t>Clasificación binaria: Alto riesgo (Asesinato/Homicidio) vs. Bajo riesgo (Otros)</w:t>
+            </w:r>
+          </w:p>
+        </w:tc>
+      </w:tr>
+      <w:tr>
+        <w:trPr>
+          <w:tblCellSpacing w:w="15" w:type="dxa"/>
+        </w:trPr>
+        <w:tc>
+          <w:tcPr>
+            <w:tcW w:w="0" w:type="auto"/>
+            <w:shd w:val="clear" w:color="auto" w:fill="FFFFFF"/>
+            <w:tcMar>
+              <w:top w:w="90" w:type="dxa"/>
+              <w:left w:w="120" w:type="dxa"/>
+              <w:bottom w:w="90" w:type="dxa"/>
+              <w:right w:w="120" w:type="dxa"/>
+            </w:tcMar>
+            <w:vAlign w:val="center"/>
+            <w:hideMark/>
+          </w:tcPr>
+          <w:p>
+            <w:pPr>
+              <w:spacing w:line="360" w:lineRule="auto"/>
+              <w:rPr>
+                <w:color w:val="8A0000"/>
+              </w:rPr>
+            </w:pPr>
+            <w:r>
+              <w:rPr>
+                <w:color w:val="8A0000"/>
+              </w:rPr>
+              <w:t>Proporción de clases</w:t>
+            </w:r>
+          </w:p>
+        </w:tc>
+        <w:tc>
+          <w:tcPr>
+            <w:tcW w:w="0" w:type="auto"/>
+            <w:shd w:val="clear" w:color="auto" w:fill="FFFFFF"/>
+            <w:tcMar>
+              <w:top w:w="90" w:type="dxa"/>
+              <w:left w:w="120" w:type="dxa"/>
+              <w:bottom w:w="90" w:type="dxa"/>
+              <w:right w:w="120" w:type="dxa"/>
+            </w:tcMar>
+            <w:vAlign w:val="center"/>
+            <w:hideMark/>
+          </w:tcPr>
+          <w:p>
+            <w:pPr>
+              <w:spacing w:line="360" w:lineRule="auto"/>
+            </w:pPr>
+            <w:r>
+              <w:rPr>
+                <w:color w:val="EE0000"/>
+              </w:rPr>
+              <w:t>18.3% alto riesgo, 81.7% bajo riesgo (desbalance moderado)</w:t>
+            </w:r>
+          </w:p>
+        </w:tc>
+      </w:tr>
+      <w:tr>
+        <w:trPr>
+          <w:tblCellSpacing w:w="15" w:type="dxa"/>
+        </w:trPr>
+        <w:tc>
+          <w:tcPr>
+            <w:tcW w:w="0" w:type="auto"/>
+            <w:shd w:val="clear" w:color="auto" w:fill="F6F8FA"/>
+            <w:tcMar>
+              <w:top w:w="90" w:type="dxa"/>
+              <w:left w:w="120" w:type="dxa"/>
+              <w:bottom w:w="90" w:type="dxa"/>
+              <w:right w:w="120" w:type="dxa"/>
+            </w:tcMar>
+            <w:vAlign w:val="center"/>
+            <w:hideMark/>
+          </w:tcPr>
+          <w:p>
+            <w:pPr>
+              <w:spacing w:line="360" w:lineRule="auto"/>
+              <w:rPr>
+                <w:color w:val="8A0000"/>
+              </w:rPr>
+            </w:pPr>
+            <w:r>
+              <w:rPr>
+                <w:b/>
+                <w:bCs/>
+                <w:color w:val="8A0000"/>
+              </w:rPr>
+              <w:t>Período cubierto</w:t>
+            </w:r>
+          </w:p>
+        </w:tc>
+        <w:tc>
+          <w:tcPr>
+            <w:tcW w:w="0" w:type="auto"/>
+            <w:shd w:val="clear" w:color="auto" w:fill="F6F8FA"/>
+            <w:tcMar>
+              <w:top w:w="90" w:type="dxa"/>
+              <w:left w:w="120" w:type="dxa"/>
+              <w:bottom w:w="90" w:type="dxa"/>
+              <w:right w:w="120" w:type="dxa"/>
+            </w:tcMar>
+            <w:vAlign w:val="center"/>
+            <w:hideMark/>
+          </w:tcPr>
+          <w:p>
+            <w:pPr>
+              <w:spacing w:line="360" w:lineRule="auto"/>
+            </w:pPr>
+            <w:r>
+              <w:t>202</w:t>
+            </w:r>
+            <w:r>
+              <w:t>1</w:t>
+            </w:r>
+            <w:r>
+              <w:t xml:space="preserve"> </w:t>
+            </w:r>
+            <w:r>
+              <w:t>–</w:t>
+            </w:r>
+            <w:r>
+              <w:t xml:space="preserve"> 202</w:t>
+            </w:r>
+            <w:r>
+              <w:t>6</w:t>
+            </w:r>
+          </w:p>
+        </w:tc>
+      </w:tr>
+    </w:tbl>
+    <w:p>
+      <w:pPr>
+        <w:spacing w:line="360" w:lineRule="auto"/>
+      </w:pPr>
+    </w:p>
+    <w:p>
+      <w:pPr>
+        <w:pStyle w:val="Prrafodelista"/>
+        <w:numPr>
+          <w:ilvl w:val="0"/>
+          <w:numId w:val="2"/>
+        </w:numPr>
+        <w:spacing w:line="360" w:lineRule="auto"/>
+        <w:ind w:left="360"/>
+        <w:rPr>
+          <w:rFonts w:ascii="Times New Roman" w:hAnsi="Times New Roman" w:cs="Times New Roman"/>
+          <w:b/>
+          <w:bCs/>
+          <w:color w:val="8A0000"/>
+          <w:szCs w:val="22"/>
+        </w:rPr>
+      </w:pPr>
+      <w:r>
+        <w:rPr>
+          <w:rFonts w:ascii="Times New Roman" w:hAnsi="Times New Roman" w:cs="Times New Roman"/>
+          <w:b/>
+          <w:bCs/>
+          <w:color w:val="8A0000"/>
+          <w:szCs w:val="22"/>
+        </w:rPr>
+        <w:t>División de datos:</w:t>
+      </w:r>
+    </w:p>
+    <w:p>
+      <w:pPr>
+        <w:pStyle w:val="Prrafodelista"/>
+        <w:spacing w:line="360" w:lineRule="auto"/>
+        <w:ind w:left="360" w:firstLine="0"/>
+        <w:rPr>
+          <w:rFonts w:ascii="Times New Roman" w:hAnsi="Times New Roman" w:cs="Times New Roman"/>
+          <w:szCs w:val="22"/>
+        </w:rPr>
+      </w:pPr>
+    </w:p>
+    <w:p>
+      <w:pPr>
+        <w:pStyle w:val="Prrafodelista"/>
+        <w:spacing w:line="360" w:lineRule="auto"/>
+        <w:ind w:left="0" w:firstLine="0"/>
+        <w:rPr>
+          <w:rFonts w:ascii="Times New Roman" w:hAnsi="Times New Roman" w:cs="Times New Roman"/>
+          <w:szCs w:val="22"/>
+        </w:rPr>
+      </w:pPr>
+      <w:r>
+        <w:rPr>
+          <w:rFonts w:ascii="Times New Roman" w:hAnsi="Times New Roman" w:cs="Times New Roman"/>
+          <w:szCs w:val="22"/>
+        </w:rPr>
+        <w:t>Total de registros: 2,847</w:t>
+      </w:r>
+    </w:p>
+    <w:p>
+      <w:pPr>
+        <w:tabs>
+          <w:tab w:val="left" w:pos="4640"/>
+        </w:tabs>
+        <w:spacing w:line="360" w:lineRule="auto"/>
+        <w:ind w:left="-350" w:firstLine="338"/>
+        <w:rPr>
+          <w:rFonts w:ascii="Times New Roman" w:hAnsi="Times New Roman" w:cs="Times New Roman"/>
+          <w:szCs w:val="22"/>
+        </w:rPr>
+      </w:pPr>
+      <w:r>
+        <w:rPr>
+          <w:rFonts w:ascii="Times New Roman" w:hAnsi="Times New Roman" w:cs="Times New Roman"/>
+          <w:szCs w:val="22"/>
+        </w:rPr>
+        <w:t xml:space="preserve">Entrenamiento (70%): </w:t>
+      </w:r>
+    </w:p>
+    <w:p>
+      <w:pPr>
+        <w:spacing w:line="360" w:lineRule="auto"/>
+        <w:ind w:left="-350" w:firstLine="338"/>
+        <w:rPr>
+          <w:rFonts w:ascii="Times New Roman" w:hAnsi="Times New Roman" w:cs="Times New Roman"/>
+          <w:szCs w:val="22"/>
+        </w:rPr>
+      </w:pPr>
+      <w:r>
+        <w:rPr>
+          <w:rFonts w:ascii="Times New Roman" w:hAnsi="Times New Roman" w:cs="Times New Roman"/>
+          <w:szCs w:val="22"/>
+        </w:rPr>
+        <w:t xml:space="preserve">Validación (15%): </w:t>
+      </w:r>
+    </w:p>
+    <w:p>
+      <w:pPr>
+        <w:pStyle w:val="Prrafodelista"/>
+        <w:spacing w:line="360" w:lineRule="auto"/>
+        <w:ind w:left="0" w:firstLine="0"/>
+        <w:rPr>
+          <w:rFonts w:ascii="Times New Roman" w:hAnsi="Times New Roman" w:cs="Times New Roman"/>
+          <w:szCs w:val="22"/>
+        </w:rPr>
+      </w:pPr>
+      <w:r>
+        <w:rPr>
+          <w:rFonts w:ascii="Times New Roman" w:hAnsi="Times New Roman" w:cs="Times New Roman"/>
+          <w:szCs w:val="22"/>
+        </w:rPr>
+        <w:t>Prueba (15%):</w:t>
+      </w:r>
+    </w:p>
+    <w:p>
+      <w:pPr>
+        <w:pStyle w:val="Prrafodelista"/>
+        <w:spacing w:line="360" w:lineRule="auto"/>
+        <w:ind w:left="0" w:firstLine="0"/>
+        <w:rPr>
+          <w:rFonts w:ascii="Times New Roman" w:hAnsi="Times New Roman" w:cs="Times New Roman"/>
+          <w:szCs w:val="22"/>
+        </w:rPr>
+      </w:pPr>
+    </w:p>
+    <w:p>
+      <w:pPr>
+        <w:pStyle w:val="Prrafodelista"/>
+        <w:spacing w:line="360" w:lineRule="auto"/>
+        <w:ind w:left="0" w:firstLine="0"/>
+        <w:rPr>
+          <w:rFonts w:ascii="Times New Roman" w:hAnsi="Times New Roman" w:cs="Times New Roman"/>
+          <w:szCs w:val="22"/>
+        </w:rPr>
+      </w:pPr>
+      <w:r>
+        <w:rPr>
+          <w:rFonts w:ascii="Times New Roman" w:hAnsi="Times New Roman" w:cs="Times New Roman"/>
+          <w:szCs w:val="22"/>
+        </w:rPr>
+        <w:t>Proporción de alto riesgo:</w:t>
+      </w:r>
+    </w:p>
+    <w:p>
+      <w:pPr>
+        <w:pStyle w:val="Prrafodelista"/>
+        <w:spacing w:line="360" w:lineRule="auto"/>
+        <w:ind w:left="0" w:firstLine="0"/>
+        <w:rPr>
+          <w:rFonts w:ascii="Times New Roman" w:hAnsi="Times New Roman" w:cs="Times New Roman"/>
+          <w:szCs w:val="22"/>
+        </w:rPr>
+      </w:pPr>
+      <w:r>
+        <w:rPr>
+          <w:rFonts w:ascii="Times New Roman" w:hAnsi="Times New Roman" w:cs="Times New Roman"/>
+          <w:szCs w:val="22"/>
+        </w:rPr>
+        <w:t xml:space="preserve">Train: </w:t>
+      </w:r>
+    </w:p>
+    <w:p>
+      <w:pPr>
+        <w:pStyle w:val="Prrafodelista"/>
+        <w:spacing w:line="360" w:lineRule="auto"/>
+        <w:ind w:left="0" w:firstLine="0"/>
+        <w:rPr>
+          <w:rFonts w:ascii="Times New Roman" w:hAnsi="Times New Roman" w:cs="Times New Roman"/>
+          <w:szCs w:val="22"/>
+        </w:rPr>
+      </w:pPr>
+      <w:r>
+        <w:rPr>
+          <w:rFonts w:ascii="Times New Roman" w:hAnsi="Times New Roman" w:cs="Times New Roman"/>
+          <w:szCs w:val="22"/>
+        </w:rPr>
+        <w:t>Validación:</w:t>
+      </w:r>
+    </w:p>
+    <w:p>
+      <w:pPr>
+        <w:pStyle w:val="Prrafodelista"/>
+        <w:spacing w:line="360" w:lineRule="auto"/>
+        <w:ind w:left="0" w:firstLine="0"/>
+        <w:rPr>
+          <w:rFonts w:ascii="Times New Roman" w:hAnsi="Times New Roman" w:cs="Times New Roman"/>
+          <w:szCs w:val="22"/>
+        </w:rPr>
+      </w:pPr>
+      <w:r>
+        <w:rPr>
+          <w:rFonts w:ascii="Times New Roman" w:hAnsi="Times New Roman" w:cs="Times New Roman"/>
+          <w:szCs w:val="22"/>
+        </w:rPr>
+        <w:lastRenderedPageBreak/>
+        <w:t xml:space="preserve">Test: </w:t>
+      </w:r>
+    </w:p>
+    <w:p>
+      <w:pPr>
+        <w:pStyle w:val="Prrafodelista"/>
+        <w:ind w:firstLine="0"/>
+      </w:pPr>
+    </w:p>
+    <w:p>
+      <w:pPr>
+        <w:pStyle w:val="Prrafodelista"/>
+        <w:numPr>
+          <w:ilvl w:val="0"/>
+          <w:numId w:val="2"/>
+        </w:numPr>
+        <w:spacing w:line="360" w:lineRule="auto"/>
+        <w:ind w:left="360"/>
+        <w:rPr>
+          <w:rFonts w:ascii="Times New Roman" w:hAnsi="Times New Roman" w:cs="Times New Roman"/>
+          <w:b/>
+          <w:bCs/>
+          <w:color w:val="8A0000"/>
+          <w:szCs w:val="22"/>
+        </w:rPr>
+      </w:pPr>
+      <w:r>
+        <w:rPr>
+          <w:rFonts w:ascii="Times New Roman" w:hAnsi="Times New Roman" w:cs="Times New Roman"/>
+          <w:b/>
+          <w:bCs/>
+          <w:color w:val="8A0000"/>
+          <w:szCs w:val="22"/>
+        </w:rPr>
+        <w:t>Feature utilizadas:</w:t>
+      </w:r>
+    </w:p>
+    <w:p>
+      <w:pPr>
+        <w:tabs>
+          <w:tab w:val="left" w:pos="916"/>
+          <w:tab w:val="left" w:pos="1832"/>
+          <w:tab w:val="left" w:pos="2748"/>
+          <w:tab w:val="left" w:pos="3664"/>
+          <w:tab w:val="left" w:pos="4580"/>
+          <w:tab w:val="left" w:pos="5496"/>
+          <w:tab w:val="left" w:pos="6412"/>
+          <w:tab w:val="left" w:pos="7328"/>
+          <w:tab w:val="left" w:pos="8244"/>
+          <w:tab w:val="left" w:pos="9160"/>
+          <w:tab w:val="left" w:pos="10076"/>
+          <w:tab w:val="left" w:pos="10992"/>
+          <w:tab w:val="left" w:pos="11908"/>
+          <w:tab w:val="left" w:pos="12824"/>
+          <w:tab w:val="left" w:pos="13740"/>
+          <w:tab w:val="left" w:pos="14656"/>
+        </w:tabs>
+        <w:spacing w:after="0" w:line="360" w:lineRule="auto"/>
+        <w:ind w:left="0" w:firstLine="0"/>
+        <w:rPr>
+          <w:rFonts w:ascii="Times New Roman" w:eastAsia="Times New Roman" w:hAnsi="Times New Roman" w:cs="Times New Roman"/>
+          <w:color w:val="1F2328"/>
+          <w:kern w:val="0"/>
+          <w:szCs w:val="22"/>
+          <w:bdr w:val="none" w:sz="0" w:space="0" w:color="auto" w:frame="1"/>
+          <w14:ligatures w14:val="none"/>
+        </w:rPr>
+      </w:pPr>
+      <w:proofErr w:type="spellStart"/>
+      <w:r>
+        <w:rPr>
+          <w:rFonts w:ascii="Times New Roman" w:eastAsia="Times New Roman" w:hAnsi="Times New Roman" w:cs="Times New Roman"/>
+          <w:color w:val="1F2328"/>
+          <w:kern w:val="0"/>
+          <w:szCs w:val="22"/>
+          <w:bdr w:val="none" w:sz="0" w:space="0" w:color="auto" w:frame="1"/>
+          <w14:ligatures w14:val="none"/>
+        </w:rPr>
+        <w:t>Features</w:t>
+      </w:r>
+      <w:proofErr w:type="spellEnd"/>
+      <w:r>
+        <w:rPr>
+          <w:rFonts w:ascii="Times New Roman" w:eastAsia="Times New Roman" w:hAnsi="Times New Roman" w:cs="Times New Roman"/>
+          <w:color w:val="1F2328"/>
+          <w:kern w:val="0"/>
+          <w:szCs w:val="22"/>
+          <w:bdr w:val="none" w:sz="0" w:space="0" w:color="auto" w:frame="1"/>
+          <w14:ligatures w14:val="none"/>
+        </w:rPr>
+        <w:t xml:space="preserve"> geoespaciales:</w:t>
+      </w:r>
+    </w:p>
+    <w:p>
+      <w:pPr>
+        <w:tabs>
+          <w:tab w:val="left" w:pos="916"/>
+          <w:tab w:val="left" w:pos="1832"/>
+          <w:tab w:val="left" w:pos="2748"/>
+          <w:tab w:val="left" w:pos="3664"/>
+          <w:tab w:val="left" w:pos="4580"/>
+          <w:tab w:val="left" w:pos="5496"/>
+          <w:tab w:val="left" w:pos="6412"/>
+          <w:tab w:val="left" w:pos="7328"/>
+          <w:tab w:val="left" w:pos="8244"/>
+          <w:tab w:val="left" w:pos="9160"/>
+          <w:tab w:val="left" w:pos="10076"/>
+          <w:tab w:val="left" w:pos="10992"/>
+          <w:tab w:val="left" w:pos="11908"/>
+          <w:tab w:val="left" w:pos="12824"/>
+          <w:tab w:val="left" w:pos="13740"/>
+          <w:tab w:val="left" w:pos="14656"/>
+        </w:tabs>
+        <w:spacing w:after="0" w:line="360" w:lineRule="auto"/>
+        <w:ind w:left="0" w:firstLine="0"/>
+        <w:rPr>
+          <w:rFonts w:ascii="Times New Roman" w:eastAsia="Times New Roman" w:hAnsi="Times New Roman" w:cs="Times New Roman"/>
+          <w:color w:val="1F2328"/>
+          <w:kern w:val="0"/>
+          <w:szCs w:val="22"/>
+          <w:bdr w:val="none" w:sz="0" w:space="0" w:color="auto" w:frame="1"/>
+          <w14:ligatures w14:val="none"/>
+        </w:rPr>
+      </w:pPr>
+      <w:r>
+        <w:rPr>
+          <w:rFonts w:ascii="Times New Roman" w:eastAsia="Times New Roman" w:hAnsi="Times New Roman" w:cs="Times New Roman"/>
+          <w:color w:val="1F2328"/>
+          <w:kern w:val="0"/>
+          <w:szCs w:val="22"/>
+          <w:bdr w:val="none" w:sz="0" w:space="0" w:color="auto" w:frame="1"/>
+          <w14:ligatures w14:val="none"/>
+        </w:rPr>
+        <w:t xml:space="preserve">- </w:t>
+      </w:r>
+      <w:proofErr w:type="spellStart"/>
+      <w:r>
+        <w:rPr>
+          <w:rFonts w:ascii="Times New Roman" w:eastAsia="Times New Roman" w:hAnsi="Times New Roman" w:cs="Times New Roman"/>
+          <w:color w:val="1F2328"/>
+          <w:kern w:val="0"/>
+          <w:szCs w:val="22"/>
+          <w:bdr w:val="none" w:sz="0" w:space="0" w:color="auto" w:frame="1"/>
+          <w14:ligatures w14:val="none"/>
+        </w:rPr>
+        <w:t>provincia_encoded</w:t>
+      </w:r>
+      <w:proofErr w:type="spellEnd"/>
+      <w:r>
+        <w:rPr>
+          <w:rFonts w:ascii="Times New Roman" w:eastAsia="Times New Roman" w:hAnsi="Times New Roman" w:cs="Times New Roman"/>
+          <w:color w:val="1F2328"/>
+          <w:kern w:val="0"/>
+          <w:szCs w:val="22"/>
+          <w:bdr w:val="none" w:sz="0" w:space="0" w:color="auto" w:frame="1"/>
+          <w14:ligatures w14:val="none"/>
+        </w:rPr>
+        <w:t xml:space="preserve"> (</w:t>
+      </w:r>
+      <w:r>
+        <w:rPr>
+          <w:rFonts w:ascii="Times New Roman" w:eastAsia="Times New Roman" w:hAnsi="Times New Roman" w:cs="Times New Roman"/>
+          <w:color w:val="0550AE"/>
+          <w:kern w:val="0"/>
+          <w:szCs w:val="22"/>
+          <w:bdr w:val="none" w:sz="0" w:space="0" w:color="auto" w:frame="1"/>
+          <w14:ligatures w14:val="none"/>
+        </w:rPr>
+        <w:t>0</w:t>
+      </w:r>
+      <w:r>
+        <w:rPr>
+          <w:rFonts w:ascii="Times New Roman" w:eastAsia="Times New Roman" w:hAnsi="Times New Roman" w:cs="Times New Roman"/>
+          <w:color w:val="1F2328"/>
+          <w:kern w:val="0"/>
+          <w:szCs w:val="22"/>
+          <w:bdr w:val="none" w:sz="0" w:space="0" w:color="auto" w:frame="1"/>
+          <w14:ligatures w14:val="none"/>
+        </w:rPr>
+        <w:t>-</w:t>
+      </w:r>
+      <w:r>
+        <w:rPr>
+          <w:rFonts w:ascii="Times New Roman" w:eastAsia="Times New Roman" w:hAnsi="Times New Roman" w:cs="Times New Roman"/>
+          <w:color w:val="0550AE"/>
+          <w:kern w:val="0"/>
+          <w:szCs w:val="22"/>
+          <w:bdr w:val="none" w:sz="0" w:space="0" w:color="auto" w:frame="1"/>
+          <w14:ligatures w14:val="none"/>
+        </w:rPr>
+        <w:t>23</w:t>
+      </w:r>
+      <w:r>
+        <w:rPr>
+          <w:rFonts w:ascii="Times New Roman" w:eastAsia="Times New Roman" w:hAnsi="Times New Roman" w:cs="Times New Roman"/>
+          <w:color w:val="1F2328"/>
+          <w:kern w:val="0"/>
+          <w:szCs w:val="22"/>
+          <w:bdr w:val="none" w:sz="0" w:space="0" w:color="auto" w:frame="1"/>
+          <w14:ligatures w14:val="none"/>
+        </w:rPr>
+        <w:t>)</w:t>
+      </w:r>
+    </w:p>
+    <w:p>
+      <w:pPr>
+        <w:tabs>
+          <w:tab w:val="left" w:pos="916"/>
+          <w:tab w:val="left" w:pos="1832"/>
+          <w:tab w:val="left" w:pos="2748"/>
+          <w:tab w:val="left" w:pos="3664"/>
+          <w:tab w:val="left" w:pos="4580"/>
+          <w:tab w:val="left" w:pos="5496"/>
+          <w:tab w:val="left" w:pos="6412"/>
+          <w:tab w:val="left" w:pos="7328"/>
+          <w:tab w:val="left" w:pos="8244"/>
+          <w:tab w:val="left" w:pos="9160"/>
+          <w:tab w:val="left" w:pos="10076"/>
+          <w:tab w:val="left" w:pos="10992"/>
+          <w:tab w:val="left" w:pos="11908"/>
+          <w:tab w:val="left" w:pos="12824"/>
+          <w:tab w:val="left" w:pos="13740"/>
+          <w:tab w:val="left" w:pos="14656"/>
+        </w:tabs>
+        <w:spacing w:after="0" w:line="360" w:lineRule="auto"/>
+        <w:ind w:left="0" w:firstLine="0"/>
+        <w:rPr>
+          <w:rFonts w:ascii="Times New Roman" w:eastAsia="Times New Roman" w:hAnsi="Times New Roman" w:cs="Times New Roman"/>
+          <w:color w:val="1F2328"/>
+          <w:kern w:val="0"/>
+          <w:szCs w:val="22"/>
+          <w:bdr w:val="none" w:sz="0" w:space="0" w:color="auto" w:frame="1"/>
+          <w14:ligatures w14:val="none"/>
+        </w:rPr>
+      </w:pPr>
+      <w:r>
+        <w:rPr>
+          <w:rFonts w:ascii="Times New Roman" w:eastAsia="Times New Roman" w:hAnsi="Times New Roman" w:cs="Times New Roman"/>
+          <w:color w:val="1F2328"/>
+          <w:kern w:val="0"/>
+          <w:szCs w:val="22"/>
+          <w:bdr w:val="none" w:sz="0" w:space="0" w:color="auto" w:frame="1"/>
+          <w14:ligatures w14:val="none"/>
+        </w:rPr>
+        <w:t xml:space="preserve">- </w:t>
+      </w:r>
+      <w:proofErr w:type="spellStart"/>
+      <w:r>
+        <w:rPr>
+          <w:rFonts w:ascii="Times New Roman" w:eastAsia="Times New Roman" w:hAnsi="Times New Roman" w:cs="Times New Roman"/>
+          <w:color w:val="1F2328"/>
+          <w:kern w:val="0"/>
+          <w:szCs w:val="22"/>
+          <w:bdr w:val="none" w:sz="0" w:space="0" w:color="auto" w:frame="1"/>
+          <w14:ligatures w14:val="none"/>
+        </w:rPr>
+        <w:t>canton_encoded</w:t>
+      </w:r>
+      <w:proofErr w:type="spellEnd"/>
+      <w:r>
+        <w:rPr>
+          <w:rFonts w:ascii="Times New Roman" w:eastAsia="Times New Roman" w:hAnsi="Times New Roman" w:cs="Times New Roman"/>
+          <w:color w:val="1F2328"/>
+          <w:kern w:val="0"/>
+          <w:szCs w:val="22"/>
+          <w:bdr w:val="none" w:sz="0" w:space="0" w:color="auto" w:frame="1"/>
+          <w14:ligatures w14:val="none"/>
+        </w:rPr>
+        <w:t xml:space="preserve"> (</w:t>
+      </w:r>
+      <w:r>
+        <w:rPr>
+          <w:rFonts w:ascii="Times New Roman" w:eastAsia="Times New Roman" w:hAnsi="Times New Roman" w:cs="Times New Roman"/>
+          <w:color w:val="0550AE"/>
+          <w:kern w:val="0"/>
+          <w:szCs w:val="22"/>
+          <w:bdr w:val="none" w:sz="0" w:space="0" w:color="auto" w:frame="1"/>
+          <w14:ligatures w14:val="none"/>
+        </w:rPr>
+        <w:t>0</w:t>
+      </w:r>
+      <w:r>
+        <w:rPr>
+          <w:rFonts w:ascii="Times New Roman" w:eastAsia="Times New Roman" w:hAnsi="Times New Roman" w:cs="Times New Roman"/>
+          <w:color w:val="1F2328"/>
+          <w:kern w:val="0"/>
+          <w:szCs w:val="22"/>
+          <w:bdr w:val="none" w:sz="0" w:space="0" w:color="auto" w:frame="1"/>
+          <w14:ligatures w14:val="none"/>
+        </w:rPr>
+        <w:t>-</w:t>
+      </w:r>
+      <w:r>
+        <w:rPr>
+          <w:rFonts w:ascii="Times New Roman" w:eastAsia="Times New Roman" w:hAnsi="Times New Roman" w:cs="Times New Roman"/>
+          <w:color w:val="0550AE"/>
+          <w:kern w:val="0"/>
+          <w:szCs w:val="22"/>
+          <w:bdr w:val="none" w:sz="0" w:space="0" w:color="auto" w:frame="1"/>
+          <w14:ligatures w14:val="none"/>
+        </w:rPr>
+        <w:t>65</w:t>
+      </w:r>
+      <w:r>
+        <w:rPr>
+          <w:rFonts w:ascii="Times New Roman" w:eastAsia="Times New Roman" w:hAnsi="Times New Roman" w:cs="Times New Roman"/>
+          <w:color w:val="1F2328"/>
+          <w:kern w:val="0"/>
+          <w:szCs w:val="22"/>
+          <w:bdr w:val="none" w:sz="0" w:space="0" w:color="auto" w:frame="1"/>
+          <w14:ligatures w14:val="none"/>
+        </w:rPr>
+        <w:t>)</w:t>
+      </w:r>
+    </w:p>
+    <w:p>
+      <w:pPr>
+        <w:tabs>
+          <w:tab w:val="left" w:pos="916"/>
+          <w:tab w:val="left" w:pos="1832"/>
+          <w:tab w:val="left" w:pos="2748"/>
+          <w:tab w:val="left" w:pos="3664"/>
+          <w:tab w:val="left" w:pos="4580"/>
+          <w:tab w:val="left" w:pos="5496"/>
+          <w:tab w:val="left" w:pos="6412"/>
+          <w:tab w:val="left" w:pos="7328"/>
+          <w:tab w:val="left" w:pos="8244"/>
+          <w:tab w:val="left" w:pos="9160"/>
+          <w:tab w:val="left" w:pos="10076"/>
+          <w:tab w:val="left" w:pos="10992"/>
+          <w:tab w:val="left" w:pos="11908"/>
+          <w:tab w:val="left" w:pos="12824"/>
+          <w:tab w:val="left" w:pos="13740"/>
+          <w:tab w:val="left" w:pos="14656"/>
+        </w:tabs>
+        <w:spacing w:after="0" w:line="360" w:lineRule="auto"/>
+        <w:ind w:left="0" w:firstLine="0"/>
+        <w:rPr>
+          <w:rFonts w:ascii="Times New Roman" w:eastAsia="Times New Roman" w:hAnsi="Times New Roman" w:cs="Times New Roman"/>
+          <w:color w:val="1F2328"/>
+          <w:kern w:val="0"/>
+          <w:szCs w:val="22"/>
+          <w:bdr w:val="none" w:sz="0" w:space="0" w:color="auto" w:frame="1"/>
+          <w14:ligatures w14:val="none"/>
+        </w:rPr>
+      </w:pPr>
+      <w:r>
+        <w:rPr>
+          <w:rFonts w:ascii="Times New Roman" w:eastAsia="Times New Roman" w:hAnsi="Times New Roman" w:cs="Times New Roman"/>
+          <w:color w:val="1F2328"/>
+          <w:kern w:val="0"/>
+          <w:szCs w:val="22"/>
+          <w:bdr w:val="none" w:sz="0" w:space="0" w:color="auto" w:frame="1"/>
+          <w14:ligatures w14:val="none"/>
+        </w:rPr>
+        <w:t xml:space="preserve">- </w:t>
+      </w:r>
+      <w:proofErr w:type="spellStart"/>
+      <w:proofErr w:type="gramStart"/>
+      <w:r>
+        <w:rPr>
+          <w:rFonts w:ascii="Times New Roman" w:eastAsia="Times New Roman" w:hAnsi="Times New Roman" w:cs="Times New Roman"/>
+          <w:color w:val="1F2328"/>
+          <w:kern w:val="0"/>
+          <w:szCs w:val="22"/>
+          <w:bdr w:val="none" w:sz="0" w:space="0" w:color="auto" w:frame="1"/>
+          <w14:ligatures w14:val="none"/>
+        </w:rPr>
+        <w:t>cluster</w:t>
+      </w:r>
+      <w:proofErr w:type="gramEnd"/>
+      <w:r>
+        <w:rPr>
+          <w:rFonts w:ascii="Times New Roman" w:eastAsia="Times New Roman" w:hAnsi="Times New Roman" w:cs="Times New Roman"/>
+          <w:color w:val="1F2328"/>
+          <w:kern w:val="0"/>
+          <w:szCs w:val="22"/>
+          <w:bdr w:val="none" w:sz="0" w:space="0" w:color="auto" w:frame="1"/>
+          <w14:ligatures w14:val="none"/>
+        </w:rPr>
+        <w:t>_kmeans</w:t>
+      </w:r>
+      <w:proofErr w:type="spellEnd"/>
+      <w:r>
+        <w:rPr>
+          <w:rFonts w:ascii="Times New Roman" w:eastAsia="Times New Roman" w:hAnsi="Times New Roman" w:cs="Times New Roman"/>
+          <w:color w:val="1F2328"/>
+          <w:kern w:val="0"/>
+          <w:szCs w:val="22"/>
+          <w:bdr w:val="none" w:sz="0" w:space="0" w:color="auto" w:frame="1"/>
+          <w14:ligatures w14:val="none"/>
+        </w:rPr>
+        <w:t xml:space="preserve"> (</w:t>
+      </w:r>
+      <w:r>
+        <w:rPr>
+          <w:rFonts w:ascii="Times New Roman" w:eastAsia="Times New Roman" w:hAnsi="Times New Roman" w:cs="Times New Roman"/>
+          <w:color w:val="0550AE"/>
+          <w:kern w:val="0"/>
+          <w:szCs w:val="22"/>
+          <w:bdr w:val="none" w:sz="0" w:space="0" w:color="auto" w:frame="1"/>
+          <w14:ligatures w14:val="none"/>
+        </w:rPr>
+        <w:t>0</w:t>
+      </w:r>
+      <w:r>
+        <w:rPr>
+          <w:rFonts w:ascii="Times New Roman" w:eastAsia="Times New Roman" w:hAnsi="Times New Roman" w:cs="Times New Roman"/>
+          <w:color w:val="1F2328"/>
+          <w:kern w:val="0"/>
+          <w:szCs w:val="22"/>
+          <w:bdr w:val="none" w:sz="0" w:space="0" w:color="auto" w:frame="1"/>
+          <w14:ligatures w14:val="none"/>
+        </w:rPr>
+        <w:t>-</w:t>
+      </w:r>
+      <w:r>
+        <w:rPr>
+          <w:rFonts w:ascii="Times New Roman" w:eastAsia="Times New Roman" w:hAnsi="Times New Roman" w:cs="Times New Roman"/>
+          <w:color w:val="0550AE"/>
+          <w:kern w:val="0"/>
+          <w:szCs w:val="22"/>
+          <w:bdr w:val="none" w:sz="0" w:space="0" w:color="auto" w:frame="1"/>
+          <w14:ligatures w14:val="none"/>
+        </w:rPr>
+        <w:t>2</w:t>
+      </w:r>
+      <w:r>
+        <w:rPr>
+          <w:rFonts w:ascii="Times New Roman" w:eastAsia="Times New Roman" w:hAnsi="Times New Roman" w:cs="Times New Roman"/>
+          <w:color w:val="1F2328"/>
+          <w:kern w:val="0"/>
+          <w:szCs w:val="22"/>
+          <w:bdr w:val="none" w:sz="0" w:space="0" w:color="auto" w:frame="1"/>
+          <w14:ligatures w14:val="none"/>
+        </w:rPr>
+        <w:t>)</w:t>
+      </w:r>
+    </w:p>
+    <w:p>
+      <w:pPr>
+        <w:tabs>
+          <w:tab w:val="left" w:pos="916"/>
+          <w:tab w:val="left" w:pos="1832"/>
+          <w:tab w:val="left" w:pos="2748"/>
+          <w:tab w:val="left" w:pos="3664"/>
+          <w:tab w:val="left" w:pos="4580"/>
+          <w:tab w:val="left" w:pos="5496"/>
+          <w:tab w:val="left" w:pos="6412"/>
+          <w:tab w:val="left" w:pos="7328"/>
+          <w:tab w:val="left" w:pos="8244"/>
+          <w:tab w:val="left" w:pos="9160"/>
+          <w:tab w:val="left" w:pos="10076"/>
+          <w:tab w:val="left" w:pos="10992"/>
+          <w:tab w:val="left" w:pos="11908"/>
+          <w:tab w:val="left" w:pos="12824"/>
+          <w:tab w:val="left" w:pos="13740"/>
+          <w:tab w:val="left" w:pos="14656"/>
+        </w:tabs>
+        <w:spacing w:after="0" w:line="360" w:lineRule="auto"/>
+        <w:ind w:left="0" w:firstLine="0"/>
+        <w:rPr>
+          <w:rFonts w:ascii="Times New Roman" w:eastAsia="Times New Roman" w:hAnsi="Times New Roman" w:cs="Times New Roman"/>
+          <w:color w:val="1F2328"/>
+          <w:kern w:val="0"/>
+          <w:szCs w:val="22"/>
+          <w:bdr w:val="none" w:sz="0" w:space="0" w:color="auto" w:frame="1"/>
+          <w14:ligatures w14:val="none"/>
+        </w:rPr>
+      </w:pPr>
+    </w:p>
+    <w:p>
+      <w:pPr>
+        <w:tabs>
+          <w:tab w:val="left" w:pos="916"/>
+          <w:tab w:val="left" w:pos="1832"/>
+          <w:tab w:val="left" w:pos="2748"/>
+          <w:tab w:val="left" w:pos="3664"/>
+          <w:tab w:val="left" w:pos="4580"/>
+          <w:tab w:val="left" w:pos="5496"/>
+          <w:tab w:val="left" w:pos="6412"/>
+          <w:tab w:val="left" w:pos="7328"/>
+          <w:tab w:val="left" w:pos="8244"/>
+          <w:tab w:val="left" w:pos="9160"/>
+          <w:tab w:val="left" w:pos="10076"/>
+          <w:tab w:val="left" w:pos="10992"/>
+          <w:tab w:val="left" w:pos="11908"/>
+          <w:tab w:val="left" w:pos="12824"/>
+          <w:tab w:val="left" w:pos="13740"/>
+          <w:tab w:val="left" w:pos="14656"/>
+        </w:tabs>
+        <w:spacing w:after="0" w:line="360" w:lineRule="auto"/>
+        <w:ind w:left="0" w:firstLine="0"/>
+        <w:rPr>
+          <w:rFonts w:ascii="Times New Roman" w:eastAsia="Times New Roman" w:hAnsi="Times New Roman" w:cs="Times New Roman"/>
+          <w:color w:val="1F2328"/>
+          <w:kern w:val="0"/>
+          <w:szCs w:val="22"/>
+          <w:bdr w:val="none" w:sz="0" w:space="0" w:color="auto" w:frame="1"/>
+          <w14:ligatures w14:val="none"/>
+        </w:rPr>
+      </w:pPr>
+      <w:proofErr w:type="spellStart"/>
+      <w:r>
+        <w:rPr>
+          <w:rFonts w:ascii="Times New Roman" w:eastAsia="Times New Roman" w:hAnsi="Times New Roman" w:cs="Times New Roman"/>
+          <w:color w:val="1F2328"/>
+          <w:kern w:val="0"/>
+          <w:szCs w:val="22"/>
+          <w:bdr w:val="none" w:sz="0" w:space="0" w:color="auto" w:frame="1"/>
+          <w14:ligatures w14:val="none"/>
+        </w:rPr>
+        <w:t>Features</w:t>
+      </w:r>
+      <w:proofErr w:type="spellEnd"/>
+      <w:r>
+        <w:rPr>
+          <w:rFonts w:ascii="Times New Roman" w:eastAsia="Times New Roman" w:hAnsi="Times New Roman" w:cs="Times New Roman"/>
+          <w:color w:val="1F2328"/>
+          <w:kern w:val="0"/>
+          <w:szCs w:val="22"/>
+          <w:bdr w:val="none" w:sz="0" w:space="0" w:color="auto" w:frame="1"/>
+          <w14:ligatures w14:val="none"/>
+        </w:rPr>
+        <w:t xml:space="preserve"> temporales:</w:t>
+      </w:r>
+    </w:p>
+    <w:p>
+      <w:pPr>
+        <w:tabs>
+          <w:tab w:val="left" w:pos="916"/>
+          <w:tab w:val="left" w:pos="1832"/>
+          <w:tab w:val="left" w:pos="2748"/>
+          <w:tab w:val="left" w:pos="3664"/>
+          <w:tab w:val="left" w:pos="4580"/>
+          <w:tab w:val="left" w:pos="5496"/>
+          <w:tab w:val="left" w:pos="6412"/>
+          <w:tab w:val="left" w:pos="7328"/>
+          <w:tab w:val="left" w:pos="8244"/>
+          <w:tab w:val="left" w:pos="9160"/>
+          <w:tab w:val="left" w:pos="10076"/>
+          <w:tab w:val="left" w:pos="10992"/>
+          <w:tab w:val="left" w:pos="11908"/>
+          <w:tab w:val="left" w:pos="12824"/>
+          <w:tab w:val="left" w:pos="13740"/>
+          <w:tab w:val="left" w:pos="14656"/>
+        </w:tabs>
+        <w:spacing w:after="0" w:line="360" w:lineRule="auto"/>
+        <w:ind w:left="0" w:firstLine="0"/>
+        <w:rPr>
+          <w:rFonts w:ascii="Times New Roman" w:eastAsia="Times New Roman" w:hAnsi="Times New Roman" w:cs="Times New Roman"/>
+          <w:color w:val="1F2328"/>
+          <w:kern w:val="0"/>
+          <w:szCs w:val="22"/>
+          <w:bdr w:val="none" w:sz="0" w:space="0" w:color="auto" w:frame="1"/>
+          <w14:ligatures w14:val="none"/>
+        </w:rPr>
+      </w:pPr>
+      <w:r>
+        <w:rPr>
+          <w:rFonts w:ascii="Times New Roman" w:eastAsia="Times New Roman" w:hAnsi="Times New Roman" w:cs="Times New Roman"/>
+          <w:color w:val="1F2328"/>
+          <w:kern w:val="0"/>
+          <w:szCs w:val="22"/>
+          <w:bdr w:val="none" w:sz="0" w:space="0" w:color="auto" w:frame="1"/>
+          <w14:ligatures w14:val="none"/>
+        </w:rPr>
+        <w:t>- mes (</w:t>
+      </w:r>
+      <w:r>
+        <w:rPr>
+          <w:rFonts w:ascii="Times New Roman" w:eastAsia="Times New Roman" w:hAnsi="Times New Roman" w:cs="Times New Roman"/>
+          <w:color w:val="0550AE"/>
+          <w:kern w:val="0"/>
+          <w:szCs w:val="22"/>
+          <w:bdr w:val="none" w:sz="0" w:space="0" w:color="auto" w:frame="1"/>
+          <w14:ligatures w14:val="none"/>
+        </w:rPr>
+        <w:t>1</w:t>
+      </w:r>
+      <w:r>
+        <w:rPr>
+          <w:rFonts w:ascii="Times New Roman" w:eastAsia="Times New Roman" w:hAnsi="Times New Roman" w:cs="Times New Roman"/>
+          <w:color w:val="1F2328"/>
+          <w:kern w:val="0"/>
+          <w:szCs w:val="22"/>
+          <w:bdr w:val="none" w:sz="0" w:space="0" w:color="auto" w:frame="1"/>
+          <w14:ligatures w14:val="none"/>
+        </w:rPr>
+        <w:t>-</w:t>
+      </w:r>
+      <w:r>
+        <w:rPr>
+          <w:rFonts w:ascii="Times New Roman" w:eastAsia="Times New Roman" w:hAnsi="Times New Roman" w:cs="Times New Roman"/>
+          <w:color w:val="0550AE"/>
+          <w:kern w:val="0"/>
+          <w:szCs w:val="22"/>
+          <w:bdr w:val="none" w:sz="0" w:space="0" w:color="auto" w:frame="1"/>
+          <w14:ligatures w14:val="none"/>
+        </w:rPr>
+        <w:t>12</w:t>
+      </w:r>
+      <w:r>
+        <w:rPr>
+          <w:rFonts w:ascii="Times New Roman" w:eastAsia="Times New Roman" w:hAnsi="Times New Roman" w:cs="Times New Roman"/>
+          <w:color w:val="1F2328"/>
+          <w:kern w:val="0"/>
+          <w:szCs w:val="22"/>
+          <w:bdr w:val="none" w:sz="0" w:space="0" w:color="auto" w:frame="1"/>
+          <w14:ligatures w14:val="none"/>
+        </w:rPr>
+        <w:t>)</w:t>
+      </w:r>
+    </w:p>
+    <w:p>
+      <w:pPr>
+        <w:tabs>
+          <w:tab w:val="left" w:pos="916"/>
+          <w:tab w:val="left" w:pos="1832"/>
+          <w:tab w:val="left" w:pos="2748"/>
+          <w:tab w:val="left" w:pos="3664"/>
+          <w:tab w:val="left" w:pos="4580"/>
+          <w:tab w:val="left" w:pos="5496"/>
+          <w:tab w:val="left" w:pos="6412"/>
+          <w:tab w:val="left" w:pos="7328"/>
+          <w:tab w:val="left" w:pos="8244"/>
+          <w:tab w:val="left" w:pos="9160"/>
+          <w:tab w:val="left" w:pos="10076"/>
+          <w:tab w:val="left" w:pos="10992"/>
+          <w:tab w:val="left" w:pos="11908"/>
+          <w:tab w:val="left" w:pos="12824"/>
+          <w:tab w:val="left" w:pos="13740"/>
+          <w:tab w:val="left" w:pos="14656"/>
+        </w:tabs>
+        <w:spacing w:after="0" w:line="360" w:lineRule="auto"/>
+        <w:ind w:left="0" w:firstLine="0"/>
+        <w:rPr>
+          <w:rFonts w:ascii="Times New Roman" w:eastAsia="Times New Roman" w:hAnsi="Times New Roman" w:cs="Times New Roman"/>
+          <w:color w:val="1F2328"/>
+          <w:kern w:val="0"/>
+          <w:szCs w:val="22"/>
+          <w:bdr w:val="none" w:sz="0" w:space="0" w:color="auto" w:frame="1"/>
+          <w14:ligatures w14:val="none"/>
+        </w:rPr>
+      </w:pPr>
+      <w:r>
+        <w:rPr>
+          <w:rFonts w:ascii="Times New Roman" w:eastAsia="Times New Roman" w:hAnsi="Times New Roman" w:cs="Times New Roman"/>
+          <w:color w:val="1F2328"/>
+          <w:kern w:val="0"/>
+          <w:szCs w:val="22"/>
+          <w:bdr w:val="none" w:sz="0" w:space="0" w:color="auto" w:frame="1"/>
+          <w14:ligatures w14:val="none"/>
+        </w:rPr>
+        <w:t xml:space="preserve">- </w:t>
+      </w:r>
+      <w:proofErr w:type="spellStart"/>
+      <w:r>
+        <w:rPr>
+          <w:rFonts w:ascii="Times New Roman" w:eastAsia="Times New Roman" w:hAnsi="Times New Roman" w:cs="Times New Roman"/>
+          <w:color w:val="1F2328"/>
+          <w:kern w:val="0"/>
+          <w:szCs w:val="22"/>
+          <w:bdr w:val="none" w:sz="0" w:space="0" w:color="auto" w:frame="1"/>
+          <w14:ligatures w14:val="none"/>
+        </w:rPr>
+        <w:t>dia_semana</w:t>
+      </w:r>
+      <w:proofErr w:type="spellEnd"/>
+      <w:r>
+        <w:rPr>
+          <w:rFonts w:ascii="Times New Roman" w:eastAsia="Times New Roman" w:hAnsi="Times New Roman" w:cs="Times New Roman"/>
+          <w:color w:val="1F2328"/>
+          <w:kern w:val="0"/>
+          <w:szCs w:val="22"/>
+          <w:bdr w:val="none" w:sz="0" w:space="0" w:color="auto" w:frame="1"/>
+          <w14:ligatures w14:val="none"/>
+        </w:rPr>
+        <w:t xml:space="preserve"> (</w:t>
+      </w:r>
+      <w:r>
+        <w:rPr>
+          <w:rFonts w:ascii="Times New Roman" w:eastAsia="Times New Roman" w:hAnsi="Times New Roman" w:cs="Times New Roman"/>
+          <w:color w:val="0550AE"/>
+          <w:kern w:val="0"/>
+          <w:szCs w:val="22"/>
+          <w:bdr w:val="none" w:sz="0" w:space="0" w:color="auto" w:frame="1"/>
+          <w14:ligatures w14:val="none"/>
+        </w:rPr>
+        <w:t>0</w:t>
+      </w:r>
+      <w:r>
+        <w:rPr>
+          <w:rFonts w:ascii="Times New Roman" w:eastAsia="Times New Roman" w:hAnsi="Times New Roman" w:cs="Times New Roman"/>
+          <w:color w:val="1F2328"/>
+          <w:kern w:val="0"/>
+          <w:szCs w:val="22"/>
+          <w:bdr w:val="none" w:sz="0" w:space="0" w:color="auto" w:frame="1"/>
+          <w14:ligatures w14:val="none"/>
+        </w:rPr>
+        <w:t>-</w:t>
+      </w:r>
+      <w:r>
+        <w:rPr>
+          <w:rFonts w:ascii="Times New Roman" w:eastAsia="Times New Roman" w:hAnsi="Times New Roman" w:cs="Times New Roman"/>
+          <w:color w:val="0550AE"/>
+          <w:kern w:val="0"/>
+          <w:szCs w:val="22"/>
+          <w:bdr w:val="none" w:sz="0" w:space="0" w:color="auto" w:frame="1"/>
+          <w14:ligatures w14:val="none"/>
+        </w:rPr>
+        <w:t>6</w:t>
+      </w:r>
+      <w:r>
+        <w:rPr>
+          <w:rFonts w:ascii="Times New Roman" w:eastAsia="Times New Roman" w:hAnsi="Times New Roman" w:cs="Times New Roman"/>
+          <w:color w:val="1F2328"/>
+          <w:kern w:val="0"/>
+          <w:szCs w:val="22"/>
+          <w:bdr w:val="none" w:sz="0" w:space="0" w:color="auto" w:frame="1"/>
+          <w14:ligatures w14:val="none"/>
+        </w:rPr>
+        <w:t>)</w:t>
+      </w:r>
+    </w:p>
+    <w:p>
+      <w:pPr>
+        <w:tabs>
+          <w:tab w:val="left" w:pos="916"/>
+          <w:tab w:val="left" w:pos="1832"/>
+          <w:tab w:val="left" w:pos="2748"/>
+          <w:tab w:val="left" w:pos="3664"/>
+          <w:tab w:val="left" w:pos="4580"/>
+          <w:tab w:val="left" w:pos="5496"/>
+          <w:tab w:val="left" w:pos="6412"/>
+          <w:tab w:val="left" w:pos="7328"/>
+          <w:tab w:val="left" w:pos="8244"/>
+          <w:tab w:val="left" w:pos="9160"/>
+          <w:tab w:val="left" w:pos="10076"/>
+          <w:tab w:val="left" w:pos="10992"/>
+          <w:tab w:val="left" w:pos="11908"/>
+          <w:tab w:val="left" w:pos="12824"/>
+          <w:tab w:val="left" w:pos="13740"/>
+          <w:tab w:val="left" w:pos="14656"/>
+        </w:tabs>
+        <w:spacing w:after="0" w:line="240" w:lineRule="auto"/>
+        <w:ind w:left="0" w:firstLine="0"/>
+        <w:rPr>
+          <w:rFonts w:ascii="Times New Roman" w:eastAsia="Times New Roman" w:hAnsi="Times New Roman" w:cs="Times New Roman"/>
+          <w:color w:val="1F2328"/>
+          <w:kern w:val="0"/>
+          <w:szCs w:val="22"/>
+          <w:bdr w:val="none" w:sz="0" w:space="0" w:color="auto" w:frame="1"/>
+          <w14:ligatures w14:val="none"/>
+        </w:rPr>
+      </w:pPr>
+      <w:r>
+        <w:rPr>
+          <w:rFonts w:ascii="Times New Roman" w:eastAsia="Times New Roman" w:hAnsi="Times New Roman" w:cs="Times New Roman"/>
+          <w:color w:val="1F2328"/>
+          <w:kern w:val="0"/>
+          <w:szCs w:val="22"/>
+          <w:bdr w:val="none" w:sz="0" w:space="0" w:color="auto" w:frame="1"/>
+          <w14:ligatures w14:val="none"/>
+        </w:rPr>
+        <w:t>- año(2021-2026)</w:t>
+      </w:r>
+    </w:p>
+    <w:p>
+      <w:pPr>
+        <w:tabs>
+          <w:tab w:val="left" w:pos="916"/>
+          <w:tab w:val="left" w:pos="1832"/>
+          <w:tab w:val="left" w:pos="2748"/>
+          <w:tab w:val="left" w:pos="3664"/>
+          <w:tab w:val="left" w:pos="4580"/>
+          <w:tab w:val="left" w:pos="5496"/>
+          <w:tab w:val="left" w:pos="6412"/>
+          <w:tab w:val="left" w:pos="7328"/>
+          <w:tab w:val="left" w:pos="8244"/>
+          <w:tab w:val="left" w:pos="9160"/>
+          <w:tab w:val="left" w:pos="10076"/>
+          <w:tab w:val="left" w:pos="10992"/>
+          <w:tab w:val="left" w:pos="11908"/>
+          <w:tab w:val="left" w:pos="12824"/>
+          <w:tab w:val="left" w:pos="13740"/>
+          <w:tab w:val="left" w:pos="14656"/>
+        </w:tabs>
+        <w:spacing w:after="0" w:line="240" w:lineRule="auto"/>
+        <w:ind w:left="0" w:firstLine="0"/>
+        <w:rPr>
+          <w:rFonts w:ascii="Times New Roman" w:eastAsia="Times New Roman" w:hAnsi="Times New Roman" w:cs="Times New Roman"/>
+          <w:color w:val="1F2328"/>
+          <w:kern w:val="0"/>
+          <w:szCs w:val="22"/>
+          <w:bdr w:val="none" w:sz="0" w:space="0" w:color="auto" w:frame="1"/>
+          <w14:ligatures w14:val="none"/>
+        </w:rPr>
+      </w:pPr>
+    </w:p>
+    <w:p>
+      <w:pPr>
+        <w:tabs>
+          <w:tab w:val="left" w:pos="916"/>
+          <w:tab w:val="left" w:pos="1832"/>
+          <w:tab w:val="left" w:pos="2748"/>
+          <w:tab w:val="left" w:pos="3664"/>
+          <w:tab w:val="left" w:pos="4580"/>
+          <w:tab w:val="left" w:pos="5496"/>
+          <w:tab w:val="left" w:pos="6412"/>
+          <w:tab w:val="left" w:pos="7328"/>
+          <w:tab w:val="left" w:pos="8244"/>
+          <w:tab w:val="left" w:pos="9160"/>
+          <w:tab w:val="left" w:pos="10076"/>
+          <w:tab w:val="left" w:pos="10992"/>
+          <w:tab w:val="left" w:pos="11908"/>
+          <w:tab w:val="left" w:pos="12824"/>
+          <w:tab w:val="left" w:pos="13740"/>
+          <w:tab w:val="left" w:pos="14656"/>
+        </w:tabs>
+        <w:spacing w:after="0" w:line="240" w:lineRule="auto"/>
+        <w:ind w:left="0" w:firstLine="0"/>
+        <w:rPr>
+          <w:rFonts w:ascii="Times New Roman" w:eastAsia="Times New Roman" w:hAnsi="Times New Roman" w:cs="Times New Roman"/>
+          <w:color w:val="1F2328"/>
+          <w:kern w:val="0"/>
+          <w:szCs w:val="22"/>
+          <w:bdr w:val="none" w:sz="0" w:space="0" w:color="auto" w:frame="1"/>
+          <w14:ligatures w14:val="none"/>
+        </w:rPr>
+      </w:pPr>
+      <w:proofErr w:type="spellStart"/>
+      <w:r>
+        <w:rPr>
+          <w:rFonts w:ascii="Times New Roman" w:eastAsia="Times New Roman" w:hAnsi="Times New Roman" w:cs="Times New Roman"/>
+          <w:color w:val="1F2328"/>
+          <w:kern w:val="0"/>
+          <w:szCs w:val="22"/>
+          <w:bdr w:val="none" w:sz="0" w:space="0" w:color="auto" w:frame="1"/>
+          <w14:ligatures w14:val="none"/>
+        </w:rPr>
+        <w:t>Features</w:t>
+      </w:r>
+      <w:proofErr w:type="spellEnd"/>
+      <w:r>
+        <w:rPr>
+          <w:rFonts w:ascii="Times New Roman" w:eastAsia="Times New Roman" w:hAnsi="Times New Roman" w:cs="Times New Roman"/>
+          <w:color w:val="1F2328"/>
+          <w:kern w:val="0"/>
+          <w:szCs w:val="22"/>
+          <w:bdr w:val="none" w:sz="0" w:space="0" w:color="auto" w:frame="1"/>
+          <w14:ligatures w14:val="none"/>
+        </w:rPr>
+        <w:t xml:space="preserve"> de tipo de incidente:</w:t>
+      </w:r>
+    </w:p>
+    <w:p>
+      <w:pPr>
+        <w:tabs>
+          <w:tab w:val="left" w:pos="916"/>
+          <w:tab w:val="left" w:pos="1832"/>
+          <w:tab w:val="left" w:pos="2748"/>
+          <w:tab w:val="left" w:pos="3664"/>
+          <w:tab w:val="left" w:pos="4580"/>
+          <w:tab w:val="left" w:pos="5496"/>
+          <w:tab w:val="left" w:pos="6412"/>
+          <w:tab w:val="left" w:pos="7328"/>
+          <w:tab w:val="left" w:pos="8244"/>
+          <w:tab w:val="left" w:pos="9160"/>
+          <w:tab w:val="left" w:pos="10076"/>
+          <w:tab w:val="left" w:pos="10992"/>
+          <w:tab w:val="left" w:pos="11908"/>
+          <w:tab w:val="left" w:pos="12824"/>
+          <w:tab w:val="left" w:pos="13740"/>
+          <w:tab w:val="left" w:pos="14656"/>
+        </w:tabs>
+        <w:spacing w:after="0" w:line="240" w:lineRule="auto"/>
+        <w:ind w:left="0" w:firstLine="0"/>
+        <w:rPr>
+          <w:rFonts w:ascii="Times New Roman" w:eastAsia="Times New Roman" w:hAnsi="Times New Roman" w:cs="Times New Roman"/>
+          <w:color w:val="1F2328"/>
+          <w:kern w:val="0"/>
+          <w:szCs w:val="22"/>
+          <w:bdr w:val="none" w:sz="0" w:space="0" w:color="auto" w:frame="1"/>
+          <w14:ligatures w14:val="none"/>
+        </w:rPr>
+      </w:pPr>
+      <w:r>
+        <w:rPr>
+          <w:rFonts w:ascii="Times New Roman" w:eastAsia="Times New Roman" w:hAnsi="Times New Roman" w:cs="Times New Roman"/>
+          <w:color w:val="1F2328"/>
+          <w:kern w:val="0"/>
+          <w:szCs w:val="22"/>
+          <w:bdr w:val="none" w:sz="0" w:space="0" w:color="auto" w:frame="1"/>
+          <w14:ligatures w14:val="none"/>
+        </w:rPr>
+        <w:t xml:space="preserve">- </w:t>
+      </w:r>
+      <w:proofErr w:type="spellStart"/>
+      <w:r>
+        <w:rPr>
+          <w:rFonts w:ascii="Times New Roman" w:eastAsia="Times New Roman" w:hAnsi="Times New Roman" w:cs="Times New Roman"/>
+          <w:color w:val="1F2328"/>
+          <w:kern w:val="0"/>
+          <w:szCs w:val="22"/>
+          <w:bdr w:val="none" w:sz="0" w:space="0" w:color="auto" w:frame="1"/>
+          <w14:ligatures w14:val="none"/>
+        </w:rPr>
+        <w:t>subtipo_encoded</w:t>
+      </w:r>
+      <w:proofErr w:type="spellEnd"/>
+      <w:r>
+        <w:rPr>
+          <w:rFonts w:ascii="Times New Roman" w:eastAsia="Times New Roman" w:hAnsi="Times New Roman" w:cs="Times New Roman"/>
+          <w:color w:val="1F2328"/>
+          <w:kern w:val="0"/>
+          <w:szCs w:val="22"/>
+          <w:bdr w:val="none" w:sz="0" w:space="0" w:color="auto" w:frame="1"/>
+          <w14:ligatures w14:val="none"/>
+        </w:rPr>
+        <w:t xml:space="preserve"> (</w:t>
+      </w:r>
+      <w:r>
+        <w:rPr>
+          <w:rFonts w:ascii="Times New Roman" w:eastAsia="Times New Roman" w:hAnsi="Times New Roman" w:cs="Times New Roman"/>
+          <w:color w:val="0550AE"/>
+          <w:kern w:val="0"/>
+          <w:szCs w:val="22"/>
+          <w:bdr w:val="none" w:sz="0" w:space="0" w:color="auto" w:frame="1"/>
+          <w14:ligatures w14:val="none"/>
+        </w:rPr>
+        <w:t>0</w:t>
+      </w:r>
+      <w:r>
+        <w:rPr>
+          <w:rFonts w:ascii="Times New Roman" w:eastAsia="Times New Roman" w:hAnsi="Times New Roman" w:cs="Times New Roman"/>
+          <w:color w:val="1F2328"/>
+          <w:kern w:val="0"/>
+          <w:szCs w:val="22"/>
+          <w:bdr w:val="none" w:sz="0" w:space="0" w:color="auto" w:frame="1"/>
+          <w14:ligatures w14:val="none"/>
+        </w:rPr>
+        <w:t>-</w:t>
+      </w:r>
+      <w:r>
+        <w:rPr>
+          <w:rFonts w:ascii="Times New Roman" w:eastAsia="Times New Roman" w:hAnsi="Times New Roman" w:cs="Times New Roman"/>
+          <w:color w:val="0550AE"/>
+          <w:kern w:val="0"/>
+          <w:szCs w:val="22"/>
+          <w:bdr w:val="none" w:sz="0" w:space="0" w:color="auto" w:frame="1"/>
+          <w14:ligatures w14:val="none"/>
+        </w:rPr>
+        <w:t>8</w:t>
+      </w:r>
+      <w:r>
+        <w:rPr>
+          <w:rFonts w:ascii="Times New Roman" w:eastAsia="Times New Roman" w:hAnsi="Times New Roman" w:cs="Times New Roman"/>
+          <w:color w:val="1F2328"/>
+          <w:kern w:val="0"/>
+          <w:szCs w:val="22"/>
+          <w:bdr w:val="none" w:sz="0" w:space="0" w:color="auto" w:frame="1"/>
+          <w14:ligatures w14:val="none"/>
+        </w:rPr>
+        <w:t>)</w:t>
+      </w:r>
+    </w:p>
+    <w:p>
+      <w:pPr>
+        <w:tabs>
+          <w:tab w:val="left" w:pos="916"/>
+          <w:tab w:val="left" w:pos="1832"/>
+          <w:tab w:val="left" w:pos="2748"/>
+          <w:tab w:val="left" w:pos="3664"/>
+          <w:tab w:val="left" w:pos="4580"/>
+          <w:tab w:val="left" w:pos="5496"/>
+          <w:tab w:val="left" w:pos="6412"/>
+          <w:tab w:val="left" w:pos="7328"/>
+          <w:tab w:val="left" w:pos="8244"/>
+          <w:tab w:val="left" w:pos="9160"/>
+          <w:tab w:val="left" w:pos="10076"/>
+          <w:tab w:val="left" w:pos="10992"/>
+          <w:tab w:val="left" w:pos="11908"/>
+          <w:tab w:val="left" w:pos="12824"/>
+          <w:tab w:val="left" w:pos="13740"/>
+          <w:tab w:val="left" w:pos="14656"/>
+        </w:tabs>
+        <w:spacing w:after="0" w:line="240" w:lineRule="auto"/>
+        <w:ind w:left="0" w:firstLine="0"/>
+        <w:rPr>
+          <w:rFonts w:ascii="Times New Roman" w:eastAsia="Times New Roman" w:hAnsi="Times New Roman" w:cs="Times New Roman"/>
+          <w:color w:val="1F2328"/>
+          <w:kern w:val="0"/>
+          <w:szCs w:val="22"/>
+          <w:bdr w:val="none" w:sz="0" w:space="0" w:color="auto" w:frame="1"/>
+          <w14:ligatures w14:val="none"/>
+        </w:rPr>
+      </w:pPr>
+      <w:r>
+        <w:rPr>
+          <w:rFonts w:ascii="Times New Roman" w:eastAsia="Times New Roman" w:hAnsi="Times New Roman" w:cs="Times New Roman"/>
+          <w:color w:val="1F2328"/>
+          <w:kern w:val="0"/>
+          <w:szCs w:val="22"/>
+          <w:bdr w:val="none" w:sz="0" w:space="0" w:color="auto" w:frame="1"/>
+          <w14:ligatures w14:val="none"/>
+        </w:rPr>
+        <w:t xml:space="preserve">- </w:t>
+      </w:r>
+      <w:r>
+        <w:rPr>
+          <w:rFonts w:ascii="Times New Roman" w:eastAsia="Times New Roman" w:hAnsi="Times New Roman" w:cs="Times New Roman"/>
+          <w:color w:val="1F2328"/>
+          <w:kern w:val="0"/>
+          <w:szCs w:val="22"/>
+          <w:bdr w:val="none" w:sz="0" w:space="0" w:color="auto" w:frame="1"/>
+          <w14:ligatures w14:val="none"/>
+        </w:rPr>
+        <w:t>servicio</w:t>
+      </w:r>
+      <w:r>
+        <w:rPr>
+          <w:rFonts w:ascii="Times New Roman" w:eastAsia="Times New Roman" w:hAnsi="Times New Roman" w:cs="Times New Roman"/>
+          <w:color w:val="1F2328"/>
+          <w:kern w:val="0"/>
+          <w:szCs w:val="22"/>
+          <w:bdr w:val="none" w:sz="0" w:space="0" w:color="auto" w:frame="1"/>
+          <w14:ligatures w14:val="none"/>
+        </w:rPr>
+        <w:t xml:space="preserve"> (</w:t>
+      </w:r>
+      <w:r>
+        <w:rPr>
+          <w:rFonts w:ascii="Times New Roman" w:eastAsia="Times New Roman" w:hAnsi="Times New Roman" w:cs="Times New Roman"/>
+          <w:color w:val="0550AE"/>
+          <w:kern w:val="0"/>
+          <w:szCs w:val="22"/>
+          <w:bdr w:val="none" w:sz="0" w:space="0" w:color="auto" w:frame="1"/>
+          <w14:ligatures w14:val="none"/>
+        </w:rPr>
+        <w:t>0</w:t>
+      </w:r>
+      <w:r>
+        <w:rPr>
+          <w:rFonts w:ascii="Times New Roman" w:eastAsia="Times New Roman" w:hAnsi="Times New Roman" w:cs="Times New Roman"/>
+          <w:color w:val="1F2328"/>
+          <w:kern w:val="0"/>
+          <w:szCs w:val="22"/>
+          <w:bdr w:val="none" w:sz="0" w:space="0" w:color="auto" w:frame="1"/>
+          <w14:ligatures w14:val="none"/>
+        </w:rPr>
+        <w:t>-</w:t>
+      </w:r>
+      <w:r>
+        <w:rPr>
+          <w:rFonts w:ascii="Times New Roman" w:eastAsia="Times New Roman" w:hAnsi="Times New Roman" w:cs="Times New Roman"/>
+          <w:color w:val="0550AE"/>
+          <w:kern w:val="0"/>
+          <w:szCs w:val="22"/>
+          <w:bdr w:val="none" w:sz="0" w:space="0" w:color="auto" w:frame="1"/>
+          <w14:ligatures w14:val="none"/>
+        </w:rPr>
+        <w:t>1</w:t>
+      </w:r>
+      <w:r>
+        <w:rPr>
+          <w:rFonts w:ascii="Times New Roman" w:eastAsia="Times New Roman" w:hAnsi="Times New Roman" w:cs="Times New Roman"/>
+          <w:color w:val="1F2328"/>
+          <w:kern w:val="0"/>
+          <w:szCs w:val="22"/>
+          <w:bdr w:val="none" w:sz="0" w:space="0" w:color="auto" w:frame="1"/>
+          <w14:ligatures w14:val="none"/>
+        </w:rPr>
+        <w:t>)</w:t>
+      </w:r>
+    </w:p>
+    <w:p>
+      <w:pPr>
+        <w:tabs>
+          <w:tab w:val="left" w:pos="916"/>
+          <w:tab w:val="left" w:pos="1832"/>
+          <w:tab w:val="left" w:pos="2748"/>
+          <w:tab w:val="left" w:pos="3664"/>
+          <w:tab w:val="left" w:pos="4580"/>
+          <w:tab w:val="left" w:pos="5496"/>
+          <w:tab w:val="left" w:pos="6412"/>
+          <w:tab w:val="left" w:pos="7328"/>
+          <w:tab w:val="left" w:pos="8244"/>
+          <w:tab w:val="left" w:pos="9160"/>
+          <w:tab w:val="left" w:pos="10076"/>
+          <w:tab w:val="left" w:pos="10992"/>
+          <w:tab w:val="left" w:pos="11908"/>
+          <w:tab w:val="left" w:pos="12824"/>
+          <w:tab w:val="left" w:pos="13740"/>
+          <w:tab w:val="left" w:pos="14656"/>
+        </w:tabs>
+        <w:spacing w:after="0" w:line="240" w:lineRule="auto"/>
+        <w:ind w:left="0" w:firstLine="0"/>
+        <w:rPr>
+          <w:rFonts w:ascii="Times New Roman" w:eastAsia="Times New Roman" w:hAnsi="Times New Roman" w:cs="Times New Roman"/>
+          <w:color w:val="1F2328"/>
+          <w:kern w:val="0"/>
+          <w:szCs w:val="22"/>
+          <w:bdr w:val="none" w:sz="0" w:space="0" w:color="auto" w:frame="1"/>
+          <w14:ligatures w14:val="none"/>
+        </w:rPr>
+      </w:pPr>
+    </w:p>
+    <w:p>
+      <w:pPr>
+        <w:tabs>
+          <w:tab w:val="left" w:pos="916"/>
+          <w:tab w:val="left" w:pos="1832"/>
+          <w:tab w:val="left" w:pos="2748"/>
+          <w:tab w:val="left" w:pos="3664"/>
+          <w:tab w:val="left" w:pos="4580"/>
+          <w:tab w:val="left" w:pos="5496"/>
+          <w:tab w:val="left" w:pos="6412"/>
+          <w:tab w:val="left" w:pos="7328"/>
+          <w:tab w:val="left" w:pos="8244"/>
+          <w:tab w:val="left" w:pos="9160"/>
+          <w:tab w:val="left" w:pos="10076"/>
+          <w:tab w:val="left" w:pos="10992"/>
+          <w:tab w:val="left" w:pos="11908"/>
+          <w:tab w:val="left" w:pos="12824"/>
+          <w:tab w:val="left" w:pos="13740"/>
+          <w:tab w:val="left" w:pos="14656"/>
+        </w:tabs>
+        <w:spacing w:after="0" w:line="240" w:lineRule="auto"/>
+        <w:ind w:left="0" w:firstLine="0"/>
+        <w:rPr>
+          <w:rFonts w:ascii="Times New Roman" w:eastAsia="Times New Roman" w:hAnsi="Times New Roman" w:cs="Times New Roman"/>
+          <w:color w:val="1F2328"/>
+          <w:kern w:val="0"/>
+          <w:szCs w:val="22"/>
+          <w14:ligatures w14:val="none"/>
+        </w:rPr>
+      </w:pPr>
+      <w:r>
+        <w:rPr>
+          <w:rFonts w:ascii="Times New Roman" w:eastAsia="Times New Roman" w:hAnsi="Times New Roman" w:cs="Times New Roman"/>
+          <w:color w:val="1F2328"/>
+          <w:kern w:val="0"/>
+          <w:szCs w:val="22"/>
+          <w:bdr w:val="none" w:sz="0" w:space="0" w:color="auto" w:frame="1"/>
+          <w14:ligatures w14:val="none"/>
+        </w:rPr>
+        <w:t xml:space="preserve">Total de </w:t>
+      </w:r>
+      <w:proofErr w:type="spellStart"/>
+      <w:r>
+        <w:rPr>
+          <w:rFonts w:ascii="Times New Roman" w:eastAsia="Times New Roman" w:hAnsi="Times New Roman" w:cs="Times New Roman"/>
+          <w:color w:val="1F2328"/>
+          <w:kern w:val="0"/>
+          <w:szCs w:val="22"/>
+          <w:bdr w:val="none" w:sz="0" w:space="0" w:color="auto" w:frame="1"/>
+          <w14:ligatures w14:val="none"/>
+        </w:rPr>
+        <w:t>features</w:t>
+      </w:r>
+      <w:proofErr w:type="spellEnd"/>
+      <w:r>
+        <w:rPr>
+          <w:rFonts w:ascii="Times New Roman" w:eastAsia="Times New Roman" w:hAnsi="Times New Roman" w:cs="Times New Roman"/>
+          <w:color w:val="1F2328"/>
+          <w:kern w:val="0"/>
+          <w:szCs w:val="22"/>
+          <w:bdr w:val="none" w:sz="0" w:space="0" w:color="auto" w:frame="1"/>
+          <w14:ligatures w14:val="none"/>
+        </w:rPr>
+        <w:t xml:space="preserve">: </w:t>
+      </w:r>
+      <w:r>
+        <w:rPr>
+          <w:rFonts w:ascii="Times New Roman" w:eastAsia="Times New Roman" w:hAnsi="Times New Roman" w:cs="Times New Roman"/>
+          <w:color w:val="0550AE"/>
+          <w:kern w:val="0"/>
+          <w:szCs w:val="22"/>
+          <w:bdr w:val="none" w:sz="0" w:space="0" w:color="auto" w:frame="1"/>
+          <w14:ligatures w14:val="none"/>
+        </w:rPr>
+        <w:t>8</w:t>
+      </w:r>
+    </w:p>
+    <w:p>
+      <w:pPr>
+        <w:pStyle w:val="Prrafodelista"/>
+        <w:ind w:firstLine="0"/>
+      </w:pPr>
+    </w:p>
+    <w:p>
+      <w:pPr>
+        <w:ind w:left="0" w:firstLine="0"/>
+        <w:rPr>
+          <w:b/>
+          <w:bCs/>
+          <w:color w:val="8A0000"/>
+        </w:rPr>
+      </w:pPr>
+      <w:r>
+        <w:rPr>
+          <w:b/>
+          <w:bCs/>
+          <w:color w:val="8A0000"/>
+        </w:rPr>
+        <w:t>4 Configuración de modelos</w:t>
+      </w:r>
+    </w:p>
+    <w:p>
+      <w:pPr>
+        <w:ind w:left="0" w:firstLine="0"/>
+        <w:rPr>
+          <w:b/>
+          <w:bCs/>
+        </w:rPr>
+      </w:pPr>
+      <w:r>
+        <w:rPr>
+          <w:b/>
+          <w:bCs/>
+        </w:rPr>
+        <w:t>K-Means</w:t>
+      </w:r>
+    </w:p>
+    <w:p>
+      <w:pPr>
+        <w:pStyle w:val="Prrafodelista"/>
+      </w:pPr>
+      <w:r>
+        <w:t>Python</w:t>
+      </w:r>
+    </w:p>
+    <w:p>
+      <w:pPr>
+        <w:pStyle w:val="Prrafodelista"/>
+      </w:pPr>
+      <w:proofErr w:type="spellStart"/>
+      <w:r>
+        <w:t>KMeans</w:t>
+      </w:r>
+      <w:proofErr w:type="spellEnd"/>
+      <w:r>
+        <w:t>(</w:t>
+      </w:r>
+      <w:proofErr w:type="spellStart"/>
+      <w:r>
+        <w:t>n_</w:t>
+      </w:r>
+      <w:proofErr w:type="gramStart"/>
+      <w:r>
+        <w:t>clusters</w:t>
+      </w:r>
+      <w:proofErr w:type="spellEnd"/>
+      <w:proofErr w:type="gramEnd"/>
+      <w:r>
+        <w:t xml:space="preserve">=3, </w:t>
+      </w:r>
+      <w:proofErr w:type="spellStart"/>
+      <w:r>
+        <w:t>random_state</w:t>
+      </w:r>
+      <w:proofErr w:type="spellEnd"/>
+      <w:r>
+        <w:t xml:space="preserve">=42, </w:t>
+      </w:r>
+      <w:proofErr w:type="spellStart"/>
+      <w:r>
+        <w:t>n_init</w:t>
+      </w:r>
+      <w:proofErr w:type="spellEnd"/>
+      <w:r>
+        <w:t xml:space="preserve">=10, </w:t>
+      </w:r>
+      <w:proofErr w:type="spellStart"/>
+      <w:r>
+        <w:t>max_iter</w:t>
+      </w:r>
+      <w:proofErr w:type="spellEnd"/>
+      <w:r>
+        <w:t>=300)</w:t>
+      </w:r>
+    </w:p>
+    <w:p>
+      <w:pPr>
+        <w:pStyle w:val="Prrafodelista"/>
+      </w:pPr>
+      <w:r>
+        <w:t>- Propósito: Identificación no supervisada de zonas geoespaciales de riesgo</w:t>
+      </w:r>
+    </w:p>
+    <w:p>
+      <w:pPr>
+        <w:pStyle w:val="Prrafodelista"/>
+      </w:pPr>
+      <w:r>
+        <w:t xml:space="preserve">- Entrada: </w:t>
+      </w:r>
+      <w:proofErr w:type="spellStart"/>
+      <w:r>
+        <w:t>provincia_encoded</w:t>
+      </w:r>
+      <w:proofErr w:type="spellEnd"/>
+      <w:r>
+        <w:t xml:space="preserve">, </w:t>
+      </w:r>
+      <w:proofErr w:type="spellStart"/>
+      <w:r>
+        <w:t>canton_encoded</w:t>
+      </w:r>
+      <w:proofErr w:type="spellEnd"/>
+    </w:p>
+    <w:p>
+      <w:pPr>
+        <w:pStyle w:val="Prrafodelista"/>
+      </w:pPr>
+      <w:r>
+        <w:t xml:space="preserve">- Salida: 3 </w:t>
+      </w:r>
+      <w:proofErr w:type="spellStart"/>
+      <w:proofErr w:type="gramStart"/>
+      <w:r>
+        <w:t>clusters</w:t>
+      </w:r>
+      <w:proofErr w:type="spellEnd"/>
+      <w:proofErr w:type="gramEnd"/>
+      <w:r>
+        <w:t xml:space="preserve"> (bajo, medio, alto riesgo geográfico)</w:t>
+      </w:r>
+    </w:p>
+    <w:p>
+      <w:pPr>
+        <w:ind w:left="0" w:firstLine="0"/>
+        <w:rPr>
+          <w:b/>
+          <w:bCs/>
+        </w:rPr>
+      </w:pPr>
+      <w:r>
+        <w:rPr>
+          <w:b/>
+          <w:bCs/>
+        </w:rPr>
+        <w:t>Random Forest</w:t>
+      </w:r>
+    </w:p>
+    <w:p>
+      <w:pPr>
+        <w:pStyle w:val="Prrafodelista"/>
+      </w:pPr>
+      <w:r>
+        <w:t>Python</w:t>
+      </w:r>
+    </w:p>
+    <w:p>
+      <w:pPr>
+        <w:pStyle w:val="Prrafodelista"/>
+      </w:pPr>
+      <w:proofErr w:type="spellStart"/>
+      <w:r>
+        <w:t>RandomForestClassifier</w:t>
+      </w:r>
+      <w:proofErr w:type="spellEnd"/>
+      <w:r>
+        <w:t>(</w:t>
+      </w:r>
+    </w:p>
+    <w:p>
+      <w:pPr>
+        <w:pStyle w:val="Prrafodelista"/>
+      </w:pPr>
+      <w:proofErr w:type="spellStart"/>
+      <w:r>
+        <w:t>n_estimators</w:t>
+      </w:r>
+      <w:proofErr w:type="spellEnd"/>
+      <w:r>
+        <w:t>=100,</w:t>
+      </w:r>
+    </w:p>
+    <w:p>
+      <w:pPr>
+        <w:pStyle w:val="Prrafodelista"/>
+        <w:ind w:left="718"/>
+      </w:pPr>
+      <w:proofErr w:type="spellStart"/>
+      <w:r>
+        <w:t>max_depth</w:t>
+      </w:r>
+      <w:proofErr w:type="spellEnd"/>
+      <w:r>
+        <w:t>=5,          # Regularización: limita profundidad</w:t>
+      </w:r>
+    </w:p>
+    <w:p>
+      <w:pPr>
+        <w:pStyle w:val="Prrafodelista"/>
+      </w:pPr>
+      <w:proofErr w:type="spellStart"/>
+      <w:r>
+        <w:t>min_samples_split</w:t>
+      </w:r>
+      <w:proofErr w:type="spellEnd"/>
+      <w:r>
+        <w:t>=10, # Regularización: muestras mínimas para dividir</w:t>
+      </w:r>
+    </w:p>
+    <w:p>
+      <w:pPr>
+        <w:pStyle w:val="Prrafodelista"/>
+      </w:pPr>
+      <w:proofErr w:type="spellStart"/>
+      <w:r>
+        <w:t>min_samples_leaf</w:t>
+      </w:r>
+      <w:proofErr w:type="spellEnd"/>
+      <w:r>
+        <w:t>=5,   # Regularización: muestras mínimas en hoja</w:t>
+      </w:r>
+    </w:p>
+    <w:p>
+      <w:pPr>
+        <w:pStyle w:val="Prrafodelista"/>
+      </w:pPr>
+      <w:proofErr w:type="spellStart"/>
+      <w:r>
+        <w:t>max_features</w:t>
+      </w:r>
+      <w:proofErr w:type="spellEnd"/>
+      <w:r>
+        <w:t>='</w:t>
+      </w:r>
+      <w:proofErr w:type="spellStart"/>
+      <w:r>
+        <w:t>sqrt</w:t>
+      </w:r>
+      <w:proofErr w:type="spellEnd"/>
+      <w:r>
+        <w:t xml:space="preserve">',  # Regularización: </w:t>
+      </w:r>
+      <w:proofErr w:type="spellStart"/>
+      <w:r>
+        <w:t>sqrt</w:t>
+      </w:r>
+      <w:proofErr w:type="spellEnd"/>
+      <w:r>
+        <w:t xml:space="preserve"> de </w:t>
+      </w:r>
+      <w:proofErr w:type="spellStart"/>
+      <w:r>
+        <w:t>features</w:t>
+      </w:r>
+      <w:proofErr w:type="spellEnd"/>
+      <w:r>
+        <w:t xml:space="preserve"> por árbol</w:t>
+      </w:r>
+    </w:p>
+    <w:p>
+      <w:pPr>
+        <w:pStyle w:val="Prrafodelista"/>
+      </w:pPr>
+      <w:proofErr w:type="spellStart"/>
+      <w:r>
+        <w:t>random_state</w:t>
+      </w:r>
+      <w:proofErr w:type="spellEnd"/>
+      <w:r>
+        <w:t>=42,</w:t>
+      </w:r>
+    </w:p>
+    <w:p>
+      <w:pPr>
+        <w:pStyle w:val="Prrafodelista"/>
+      </w:pPr>
+      <w:proofErr w:type="spellStart"/>
+      <w:r>
+        <w:t>n_jobs</w:t>
+      </w:r>
+      <w:proofErr w:type="spellEnd"/>
+      <w:r>
+        <w:t>=-1</w:t>
+      </w:r>
+    </w:p>
+    <w:p>
+      <w:pPr>
+        <w:pStyle w:val="Prrafodelista"/>
+      </w:pPr>
+      <w:r>
+        <w:t>)</w:t>
+      </w:r>
+    </w:p>
+    <w:p>
+      <w:pPr>
+        <w:ind w:left="0" w:firstLine="0"/>
+        <w:rPr>
+          <w:b/>
+          <w:bCs/>
+        </w:rPr>
+      </w:pPr>
+      <w:r>
+        <w:rPr>
+          <w:b/>
+          <w:bCs/>
+        </w:rPr>
+        <w:t>XGBoost</w:t>
+      </w:r>
+    </w:p>
+    <w:p>
+      <w:pPr>
+        <w:pStyle w:val="Prrafodelista"/>
+      </w:pPr>
+      <w:r>
+        <w:t>Python</w:t>
+      </w:r>
+    </w:p>
+    <w:p>
+      <w:pPr>
+        <w:pStyle w:val="Prrafodelista"/>
+      </w:pPr>
+      <w:proofErr w:type="spellStart"/>
+      <w:r>
+        <w:t>XGBClassifier</w:t>
+      </w:r>
+      <w:proofErr w:type="spellEnd"/>
+      <w:r>
+        <w:t>(</w:t>
+      </w:r>
+    </w:p>
+    <w:p>
+      <w:pPr>
+        <w:pStyle w:val="Prrafodelista"/>
+      </w:pPr>
+      <w:proofErr w:type="spellStart"/>
+      <w:r>
+        <w:t>n_estimators</w:t>
+      </w:r>
+      <w:proofErr w:type="spellEnd"/>
+      <w:r>
+        <w:t>=100,</w:t>
+      </w:r>
+    </w:p>
+    <w:p>
+      <w:pPr>
+        <w:pStyle w:val="Prrafodelista"/>
+      </w:pPr>
+      <w:proofErr w:type="spellStart"/>
+      <w:r>
+        <w:lastRenderedPageBreak/>
+        <w:t>max_depth</w:t>
+      </w:r>
+      <w:proofErr w:type="spellEnd"/>
+      <w:r>
+        <w:t>=4,          # Regularización: profundidad limitada</w:t>
+      </w:r>
+    </w:p>
+    <w:p>
+      <w:pPr>
+        <w:pStyle w:val="Prrafodelista"/>
+      </w:pPr>
+      <w:proofErr w:type="spellStart"/>
+      <w:r>
+        <w:t>learning_rate</w:t>
+      </w:r>
+      <w:proofErr w:type="spellEnd"/>
+      <w:r>
+        <w:t>=0.1,    # Regularización: tasa de aprendizaje baja</w:t>
+      </w:r>
+    </w:p>
+    <w:p>
+      <w:pPr>
+        <w:pStyle w:val="Prrafodelista"/>
+      </w:pPr>
+      <w:proofErr w:type="spellStart"/>
+      <w:r>
+        <w:t>subsample</w:t>
+      </w:r>
+      <w:proofErr w:type="spellEnd"/>
+      <w:r>
+        <w:t>=0.8,        # Regularización: muestra del 80% de datos</w:t>
+      </w:r>
+    </w:p>
+    <w:p>
+      <w:pPr>
+        <w:pStyle w:val="Prrafodelista"/>
+      </w:pPr>
+      <w:proofErr w:type="spellStart"/>
+      <w:r>
+        <w:t>colsample_bytree</w:t>
+      </w:r>
+      <w:proofErr w:type="spellEnd"/>
+      <w:r>
+        <w:t xml:space="preserve">=0.8, # Regularización: muestra del 80% de </w:t>
+      </w:r>
+      <w:proofErr w:type="spellStart"/>
+      <w:r>
+        <w:t>features</w:t>
+      </w:r>
+      <w:proofErr w:type="spellEnd"/>
+    </w:p>
+    <w:p>
+      <w:pPr>
+        <w:pStyle w:val="Prrafodelista"/>
+      </w:pPr>
+      <w:proofErr w:type="spellStart"/>
+      <w:r>
+        <w:t>reg_alpha</w:t>
+      </w:r>
+      <w:proofErr w:type="spellEnd"/>
+      <w:r>
+        <w:t>=0.1,        # Regularización: L1 (Lasso)</w:t>
+      </w:r>
+    </w:p>
+    <w:p>
+      <w:pPr>
+        <w:pStyle w:val="Prrafodelista"/>
+      </w:pPr>
+      <w:proofErr w:type="spellStart"/>
+      <w:r>
+        <w:t>reg_lambda</w:t>
+      </w:r>
+      <w:proofErr w:type="spellEnd"/>
+      <w:r>
+        <w:t>=1.0,       # Regularización: L2 (Ridge)</w:t>
+      </w:r>
+    </w:p>
+    <w:p>
+      <w:pPr>
+        <w:pStyle w:val="Prrafodelista"/>
+      </w:pPr>
+      <w:proofErr w:type="spellStart"/>
+      <w:r>
+        <w:t>random_state</w:t>
+      </w:r>
+      <w:proofErr w:type="spellEnd"/>
+      <w:r>
+        <w:t>=42,</w:t>
+      </w:r>
+    </w:p>
+    <w:p>
+      <w:pPr>
+        <w:pStyle w:val="Prrafodelista"/>
+      </w:pPr>
+      <w:proofErr w:type="spellStart"/>
+      <w:r>
+        <w:t>n_jobs</w:t>
+      </w:r>
+      <w:proofErr w:type="spellEnd"/>
+      <w:r>
+        <w:t>=-1,</w:t>
+      </w:r>
+    </w:p>
+    <w:p>
+      <w:pPr>
+        <w:pStyle w:val="Prrafodelista"/>
+      </w:pPr>
+      <w:proofErr w:type="spellStart"/>
+      <w:r>
+        <w:t>early_stopping_rounds</w:t>
+      </w:r>
+      <w:proofErr w:type="spellEnd"/>
+      <w:r>
+        <w:t>=10</w:t>
+      </w:r>
+    </w:p>
+    <w:p>
+      <w:pPr>
+        <w:pStyle w:val="Prrafodelista"/>
+      </w:pPr>
+      <w:r>
+        <w:t>)</w:t>
+      </w:r>
+    </w:p>
+    <w:p>
+      <w:pPr>
+        <w:pStyle w:val="Prrafodelista"/>
+        <w:ind w:firstLine="0"/>
+        <w:rPr>
+          <w:u w:val="single"/>
+        </w:rPr>
+      </w:pPr>
+    </w:p>
+    <w:p>
+      <w:pPr>
+        <w:rPr>
+          <w:b/>
+          <w:bCs/>
+          <w:color w:val="8A0000"/>
+          <w:u w:val="single"/>
+        </w:rPr>
+      </w:pPr>
+      <w:r>
+        <w:rPr>
+          <w:b/>
+          <w:bCs/>
+          <w:color w:val="8A0000"/>
+          <w:u w:val="single"/>
+        </w:rPr>
+        <w:t>Resultados de Diagnóstico:</w:t>
+      </w:r>
+    </w:p>
+    <w:p>
+      <w:pPr>
+        <w:rPr>
+          <w:b/>
+          <w:bCs/>
+          <w:color w:val="8A0000"/>
+          <w:u w:val="single"/>
+        </w:rPr>
+      </w:pPr>
+      <w:r>
+        <w:rPr>
+          <w:b/>
+          <w:bCs/>
+          <w:color w:val="8A0000"/>
+          <w:u w:val="single"/>
+        </w:rPr>
+        <w:t>A</w:t>
+      </w:r>
+      <w:r>
+        <w:rPr>
+          <w:b/>
+          <w:bCs/>
+          <w:color w:val="8A0000"/>
+          <w:u w:val="single"/>
+        </w:rPr>
+        <w:t>nálisis de curvas de aprendizaje</w:t>
+      </w:r>
+      <w:r>
+        <w:rPr>
+          <w:b/>
+          <w:bCs/>
+          <w:color w:val="8A0000"/>
+          <w:u w:val="single"/>
+        </w:rPr>
+        <w:t>:</w:t>
+      </w:r>
+    </w:p>
+    <w:p>
+      <w:pPr>
+        <w:rPr>
+          <w:b/>
+          <w:bCs/>
+          <w:color w:val="8A0000"/>
+          <w:u w:val="single"/>
+        </w:rPr>
+      </w:pPr>
+      <w:r>
+        <w:rPr>
+          <w:b/>
+          <w:bCs/>
+          <w:color w:val="8A0000"/>
+          <w:u w:val="single"/>
+        </w:rPr>
+        <w:t>Estrategias implementadas y resultados</w:t>
+      </w:r>
+      <w:r>
+        <w:rPr>
+          <w:b/>
+          <w:bCs/>
+          <w:color w:val="8A0000"/>
+          <w:u w:val="single"/>
+        </w:rPr>
+        <w:t>:</w:t>
+      </w:r>
+    </w:p>
+    <w:p>
+      <w:pPr>
+        <w:rPr>
+          <w:b/>
+          <w:bCs/>
+          <w:color w:val="8A0000"/>
+          <w:u w:val="single"/>
+        </w:rPr>
+      </w:pPr>
+      <w:r>
+        <w:rPr>
+          <w:b/>
+          <w:bCs/>
+          <w:color w:val="8A0000"/>
+          <w:u w:val="single"/>
+        </w:rPr>
+        <w:t>Conclusiones y recomendaciones futuras</w:t>
+      </w:r>
+      <w:r>
+        <w:rPr>
+          <w:b/>
+          <w:bCs/>
+          <w:color w:val="8A0000"/>
+          <w:u w:val="single"/>
+        </w:rPr>
+        <w:t>:</w:t>
+      </w:r>
+    </w:p>
+    <w:p>
+      <w:pPr>
+        <w:rPr>
+          <w:b/>
+          <w:bCs/>
+          <w:color w:val="8A0000"/>
+          <w:u w:val="single"/>
+        </w:rPr>
+      </w:pPr>
+      <w:r>
+        <w:rPr>
+          <w:b/>
+          <w:bCs/>
+          <w:color w:val="8A0000"/>
+          <w:u w:val="single"/>
+        </w:rPr>
+        <w:t>Referencias técnicas</w:t>
+      </w:r>
+      <w:r>
+        <w:rPr>
+          <w:b/>
+          <w:bCs/>
+          <w:color w:val="8A0000"/>
+          <w:u w:val="single"/>
+        </w:rPr>
+        <w:t>:</w:t>
+      </w:r>
+    </w:p>
+    <w:p>
+      <w:pPr>
+        <w:pStyle w:val="Prrafodelista"/>
+        <w:numPr>
+          <w:ilvl w:val="0"/>
+          <w:numId w:val="1"/>
+        </w:numPr>
+        <w:rPr>
+          <w:b/>
+          <w:bCs/>
+          <w:color w:val="8A0000"/>
+        </w:rPr>
+      </w:pPr>
+      <w:r>
+        <w:rPr>
+          <w:b/>
+          <w:bCs/>
+          <w:color w:val="8A0000"/>
+        </w:rPr>
+        <w:t>Librerías utilizadas</w:t>
+      </w:r>
+    </w:p>
+    <w:p>
+      <w:r>
+        <w:t>Python</w:t>
+      </w:r>
+    </w:p>
+    <w:p>
+      <w:r>
+        <w:t>pandas==1.5.3          # Manipulación de datos</w:t>
+      </w:r>
+    </w:p>
+    <w:p>
+      <w:r>
+        <w:t>numpy==1.24.3          # Operaciones numéricas</w:t>
+      </w:r>
+    </w:p>
+    <w:p>
+      <w:proofErr w:type="spellStart"/>
+      <w:r>
+        <w:t>scikit-learn</w:t>
+      </w:r>
+      <w:proofErr w:type="spellEnd"/>
+      <w:r>
+        <w:t>==1.2.2    # Machine learning</w:t>
+      </w:r>
+    </w:p>
+    <w:p>
+      <w:proofErr w:type="spellStart"/>
+      <w:r>
+        <w:t>xgboost</w:t>
+      </w:r>
+      <w:proofErr w:type="spellEnd"/>
+      <w:r>
+        <w:t xml:space="preserve">==1.7.5         # </w:t>
+      </w:r>
+      <w:proofErr w:type="spellStart"/>
+      <w:r>
+        <w:t>Gradient</w:t>
+      </w:r>
+      <w:proofErr w:type="spellEnd"/>
+      <w:r>
+        <w:t xml:space="preserve"> </w:t>
+      </w:r>
+      <w:proofErr w:type="spellStart"/>
+      <w:r>
+        <w:t>boosting</w:t>
+      </w:r>
+      <w:proofErr w:type="spellEnd"/>
+    </w:p>
+    <w:p>
+      <w:r>
+        <w:t>matplotlib==3.7.1      # Visualización</w:t>
+      </w:r>
+    </w:p>
+    <w:p>
+      <w:r>
+        <w:t>seaborn==0.12.2        # Gráficos estadísticos</w:t>
+      </w:r>
+    </w:p>
+    <w:p>
+      <w:proofErr w:type="spellStart"/>
+      <w:r>
+        <w:t>shap</w:t>
+      </w:r>
+      <w:proofErr w:type="spellEnd"/>
+      <w:r>
+        <w:t xml:space="preserve">==0.42.0           # </w:t>
+      </w:r>
+      <w:proofErr w:type="spellStart"/>
+      <w:r>
+        <w:t>Explicabilidad</w:t>
+      </w:r>
+      <w:proofErr w:type="spellEnd"/>
+    </w:p>
+    <w:p>
+      <w:proofErr w:type="spellStart"/>
+      <w:r>
+        <w:t>optuna</w:t>
+      </w:r>
+      <w:proofErr w:type="spellEnd"/>
+      <w:r>
+        <w:t>==3.1.1          # Optimización de hiperparámetros</w:t>
+      </w:r>
+    </w:p>
+    <w:p>
+      <w:pPr>
+        <w:rPr>
+          <w:b/>
+          <w:bCs/>
+          <w:u w:val="single"/>
+        </w:rPr>
+      </w:pPr>
+    </w:p>
     <w:sectPr>
       <w:pgSz w:w="11906" w:h="16838"/>
       <w:pgMar w:top="1417" w:right="1701" w:bottom="1417" w:left="1701" w:header="708" w:footer="708" w:gutter="0"/>
@@ -2590,6 +5824,255 @@
     </w:pPr>
   </w:p>
 </w:ftr>
+</file>
+
+<file path=word/numbering.xml><?xml version="1.0" encoding="utf-8"?>
+<w:numbering xmlns:wpc="http://schemas.microsoft.com/office/word/2010/wordprocessingCanvas" xmlns:cx="http://schemas.microsoft.com/office/drawing/2014/chartex" xmlns:cx1="http://schemas.microsoft.com/office/drawing/2015/9/8/chartex" xmlns:cx2="http://schemas.microsoft.com/office/drawing/2015/10/21/chartex" xmlns:cx3="http://schemas.microsoft.com/office/drawing/2016/5/9/chartex" xmlns:cx4="http://schemas.microsoft.com/office/drawing/2016/5/10/chartex" xmlns:cx5="http://schemas.microsoft.com/office/drawing/2016/5/11/chartex" xmlns:cx6="http://schemas.microsoft.com/office/drawing/2016/5/12/chartex" xmlns:cx7="http://schemas.microsoft.com/office/drawing/2016/5/13/chartex" xmlns:cx8="http://schemas.microsoft.com/office/drawing/2016/5/14/chartex" xmlns:mc="http://schemas.openxmlformats.org/markup-compatibility/2006" xmlns:aink="http://schemas.microsoft.com/office/drawing/2016/ink" xmlns:am3d="http://schemas.microsoft.com/office/drawing/2017/model3d" xmlns:o="urn:schemas-microsoft-com:office:office" xmlns:oel="http://schemas.microsoft.com/office/2019/extlst" xmlns:r="http://schemas.openxmlformats.org/officeDocument/2006/relationships" xmlns:m="http://schemas.openxmlformats.org/officeDocument/2006/math" xmlns:v="urn:schemas-microsoft-com:vml" xmlns:wp14="http://schemas.microsoft.com/office/word/2010/wordprocessingDrawing" xmlns:wp="http://schemas.openxmlformats.org/drawingml/2006/wordprocessingDrawing" xmlns:w10="urn:schemas-microsoft-com:office:word" xmlns:w="http://schemas.openxmlformats.org/wordprocessingml/2006/main" xmlns:w14="http://schemas.microsoft.com/office/word/2010/wordml" xmlns:w15="http://schemas.microsoft.com/office/word/2012/wordml" xmlns:w16cex="http://schemas.microsoft.com/office/word/2018/wordml/cex" xmlns:w16cid="http://schemas.microsoft.com/office/word/2016/wordml/cid" xmlns:w16="http://schemas.microsoft.com/office/word/2018/wordml" xmlns:w16du="http://schemas.microsoft.com/office/word/2023/wordml/word16du" xmlns:w16sdtdh="http://schemas.microsoft.com/office/word/2020/wordml/sdtdatahash" xmlns:w16sdtfl="http://schemas.microsoft.com/office/word/2024/wordml/sdtformatlock" xmlns:w16se="http://schemas.microsoft.com/office/word/2015/wordml/symex" xmlns:wpg="http://schemas.microsoft.com/office/word/2010/wordprocessingGroup" xmlns:wpi="http://schemas.microsoft.com/office/word/2010/wordprocessingInk" xmlns:wne="http://schemas.microsoft.com/office/word/2006/wordml" xmlns:wps="http://schemas.microsoft.com/office/word/2010/wordprocessingShape" mc:Ignorable="w14 w15 w16se w16cid w16 w16cex w16sdtdh w16sdtfl w16du wp14">
+  <w:abstractNum w:abstractNumId="0" w15:restartNumberingAfterBreak="0">
+    <w:nsid w:val="69DB494C"/>
+    <w:multiLevelType w:val="multilevel"/>
+    <w:tmpl w:val="7070EEC2"/>
+    <w:lvl w:ilvl="0">
+      <w:start w:val="1"/>
+      <w:numFmt w:val="bullet"/>
+      <w:lvlText w:val=""/>
+      <w:lvlJc w:val="left"/>
+      <w:pPr>
+        <w:tabs>
+          <w:tab w:val="num" w:pos="720"/>
+        </w:tabs>
+        <w:ind w:left="720" w:hanging="360"/>
+      </w:pPr>
+      <w:rPr>
+        <w:rFonts w:ascii="Symbol" w:hAnsi="Symbol" w:hint="default"/>
+        <w:sz w:val="20"/>
+      </w:rPr>
+    </w:lvl>
+    <w:lvl w:ilvl="1" w:tentative="1">
+      <w:start w:val="1"/>
+      <w:numFmt w:val="bullet"/>
+      <w:lvlText w:val="o"/>
+      <w:lvlJc w:val="left"/>
+      <w:pPr>
+        <w:tabs>
+          <w:tab w:val="num" w:pos="1440"/>
+        </w:tabs>
+        <w:ind w:left="1440" w:hanging="360"/>
+      </w:pPr>
+      <w:rPr>
+        <w:rFonts w:ascii="Courier New" w:hAnsi="Courier New" w:hint="default"/>
+        <w:sz w:val="20"/>
+      </w:rPr>
+    </w:lvl>
+    <w:lvl w:ilvl="2" w:tentative="1">
+      <w:start w:val="1"/>
+      <w:numFmt w:val="bullet"/>
+      <w:lvlText w:val=""/>
+      <w:lvlJc w:val="left"/>
+      <w:pPr>
+        <w:tabs>
+          <w:tab w:val="num" w:pos="2160"/>
+        </w:tabs>
+        <w:ind w:left="2160" w:hanging="360"/>
+      </w:pPr>
+      <w:rPr>
+        <w:rFonts w:ascii="Wingdings" w:hAnsi="Wingdings" w:hint="default"/>
+        <w:sz w:val="20"/>
+      </w:rPr>
+    </w:lvl>
+    <w:lvl w:ilvl="3" w:tentative="1">
+      <w:start w:val="1"/>
+      <w:numFmt w:val="bullet"/>
+      <w:lvlText w:val=""/>
+      <w:lvlJc w:val="left"/>
+      <w:pPr>
+        <w:tabs>
+          <w:tab w:val="num" w:pos="2880"/>
+        </w:tabs>
+        <w:ind w:left="2880" w:hanging="360"/>
+      </w:pPr>
+      <w:rPr>
+        <w:rFonts w:ascii="Wingdings" w:hAnsi="Wingdings" w:hint="default"/>
+        <w:sz w:val="20"/>
+      </w:rPr>
+    </w:lvl>
+    <w:lvl w:ilvl="4" w:tentative="1">
+      <w:start w:val="1"/>
+      <w:numFmt w:val="bullet"/>
+      <w:lvlText w:val=""/>
+      <w:lvlJc w:val="left"/>
+      <w:pPr>
+        <w:tabs>
+          <w:tab w:val="num" w:pos="3600"/>
+        </w:tabs>
+        <w:ind w:left="3600" w:hanging="360"/>
+      </w:pPr>
+      <w:rPr>
+        <w:rFonts w:ascii="Wingdings" w:hAnsi="Wingdings" w:hint="default"/>
+        <w:sz w:val="20"/>
+      </w:rPr>
+    </w:lvl>
+    <w:lvl w:ilvl="5" w:tentative="1">
+      <w:start w:val="1"/>
+      <w:numFmt w:val="bullet"/>
+      <w:lvlText w:val=""/>
+      <w:lvlJc w:val="left"/>
+      <w:pPr>
+        <w:tabs>
+          <w:tab w:val="num" w:pos="4320"/>
+        </w:tabs>
+        <w:ind w:left="4320" w:hanging="360"/>
+      </w:pPr>
+      <w:rPr>
+        <w:rFonts w:ascii="Wingdings" w:hAnsi="Wingdings" w:hint="default"/>
+        <w:sz w:val="20"/>
+      </w:rPr>
+    </w:lvl>
+    <w:lvl w:ilvl="6" w:tentative="1">
+      <w:start w:val="1"/>
+      <w:numFmt w:val="bullet"/>
+      <w:lvlText w:val=""/>
+      <w:lvlJc w:val="left"/>
+      <w:pPr>
+        <w:tabs>
+          <w:tab w:val="num" w:pos="5040"/>
+        </w:tabs>
+        <w:ind w:left="5040" w:hanging="360"/>
+      </w:pPr>
+      <w:rPr>
+        <w:rFonts w:ascii="Wingdings" w:hAnsi="Wingdings" w:hint="default"/>
+        <w:sz w:val="20"/>
+      </w:rPr>
+    </w:lvl>
+    <w:lvl w:ilvl="7" w:tentative="1">
+      <w:start w:val="1"/>
+      <w:numFmt w:val="bullet"/>
+      <w:lvlText w:val=""/>
+      <w:lvlJc w:val="left"/>
+      <w:pPr>
+        <w:tabs>
+          <w:tab w:val="num" w:pos="5760"/>
+        </w:tabs>
+        <w:ind w:left="5760" w:hanging="360"/>
+      </w:pPr>
+      <w:rPr>
+        <w:rFonts w:ascii="Wingdings" w:hAnsi="Wingdings" w:hint="default"/>
+        <w:sz w:val="20"/>
+      </w:rPr>
+    </w:lvl>
+    <w:lvl w:ilvl="8" w:tentative="1">
+      <w:start w:val="1"/>
+      <w:numFmt w:val="bullet"/>
+      <w:lvlText w:val=""/>
+      <w:lvlJc w:val="left"/>
+      <w:pPr>
+        <w:tabs>
+          <w:tab w:val="num" w:pos="6480"/>
+        </w:tabs>
+        <w:ind w:left="6480" w:hanging="360"/>
+      </w:pPr>
+      <w:rPr>
+        <w:rFonts w:ascii="Wingdings" w:hAnsi="Wingdings" w:hint="default"/>
+        <w:sz w:val="20"/>
+      </w:rPr>
+    </w:lvl>
+  </w:abstractNum>
+  <w:abstractNum w:abstractNumId="1" w15:restartNumberingAfterBreak="0">
+    <w:nsid w:val="71DE1C82"/>
+    <w:multiLevelType w:val="hybridMultilevel"/>
+    <w:tmpl w:val="C03C3F6C"/>
+    <w:lvl w:ilvl="0" w:tplc="300A000F">
+      <w:start w:val="1"/>
+      <w:numFmt w:val="decimal"/>
+      <w:lvlText w:val="%1."/>
+      <w:lvlJc w:val="left"/>
+      <w:pPr>
+        <w:ind w:left="720" w:hanging="360"/>
+      </w:pPr>
+      <w:rPr>
+        <w:rFonts w:hint="default"/>
+      </w:rPr>
+    </w:lvl>
+    <w:lvl w:ilvl="1" w:tplc="300A0019" w:tentative="1">
+      <w:start w:val="1"/>
+      <w:numFmt w:val="lowerLetter"/>
+      <w:lvlText w:val="%2."/>
+      <w:lvlJc w:val="left"/>
+      <w:pPr>
+        <w:ind w:left="1440" w:hanging="360"/>
+      </w:pPr>
+    </w:lvl>
+    <w:lvl w:ilvl="2" w:tplc="300A001B" w:tentative="1">
+      <w:start w:val="1"/>
+      <w:numFmt w:val="lowerRoman"/>
+      <w:lvlText w:val="%3."/>
+      <w:lvlJc w:val="right"/>
+      <w:pPr>
+        <w:ind w:left="2160" w:hanging="180"/>
+      </w:pPr>
+    </w:lvl>
+    <w:lvl w:ilvl="3" w:tplc="300A000F" w:tentative="1">
+      <w:start w:val="1"/>
+      <w:numFmt w:val="decimal"/>
+      <w:lvlText w:val="%4."/>
+      <w:lvlJc w:val="left"/>
+      <w:pPr>
+        <w:ind w:left="2880" w:hanging="360"/>
+      </w:pPr>
+    </w:lvl>
+    <w:lvl w:ilvl="4" w:tplc="300A0019" w:tentative="1">
+      <w:start w:val="1"/>
+      <w:numFmt w:val="lowerLetter"/>
+      <w:lvlText w:val="%5."/>
+      <w:lvlJc w:val="left"/>
+      <w:pPr>
+        <w:ind w:left="3600" w:hanging="360"/>
+      </w:pPr>
+    </w:lvl>
+    <w:lvl w:ilvl="5" w:tplc="300A001B" w:tentative="1">
+      <w:start w:val="1"/>
+      <w:numFmt w:val="lowerRoman"/>
+      <w:lvlText w:val="%6."/>
+      <w:lvlJc w:val="right"/>
+      <w:pPr>
+        <w:ind w:left="4320" w:hanging="180"/>
+      </w:pPr>
+    </w:lvl>
+    <w:lvl w:ilvl="6" w:tplc="300A000F" w:tentative="1">
+      <w:start w:val="1"/>
+      <w:numFmt w:val="decimal"/>
+      <w:lvlText w:val="%7."/>
+      <w:lvlJc w:val="left"/>
+      <w:pPr>
+        <w:ind w:left="5040" w:hanging="360"/>
+      </w:pPr>
+    </w:lvl>
+    <w:lvl w:ilvl="7" w:tplc="300A0019" w:tentative="1">
+      <w:start w:val="1"/>
+      <w:numFmt w:val="lowerLetter"/>
+      <w:lvlText w:val="%8."/>
+      <w:lvlJc w:val="left"/>
+      <w:pPr>
+        <w:ind w:left="5760" w:hanging="360"/>
+      </w:pPr>
+    </w:lvl>
+    <w:lvl w:ilvl="8" w:tplc="300A001B" w:tentative="1">
+      <w:start w:val="1"/>
+      <w:numFmt w:val="lowerRoman"/>
+      <w:lvlText w:val="%9."/>
+      <w:lvlJc w:val="right"/>
+      <w:pPr>
+        <w:ind w:left="6480" w:hanging="180"/>
+      </w:pPr>
+    </w:lvl>
+  </w:abstractNum>
+  <w:num w:numId="1" w16cid:durableId="356545613">
+    <w:abstractNumId w:val="0"/>
+  </w:num>
+  <w:num w:numId="2" w16cid:durableId="363211040">
+    <w:abstractNumId w:val="1"/>
+  </w:num>
+</w:numbering>
 </file>
 
 <file path=word/styles.xml><?xml version="1.0" encoding="utf-8"?>
@@ -3015,8 +6498,7 @@
     <w:pPr>
       <w:keepNext/>
       <w:keepLines/>
-      <w:spacing w:before="360" w:after="80" w:line="278" w:lineRule="auto"/>
-      <w:ind w:left="0" w:firstLine="0"/>
+      <w:spacing w:before="360" w:after="80"/>
       <w:outlineLvl w:val="0"/>
     </w:pPr>
     <w:rPr>
@@ -3024,7 +6506,6 @@
       <w:color w:val="0F4761" w:themeColor="accent1" w:themeShade="BF"/>
       <w:sz w:val="40"/>
       <w:szCs w:val="40"/>
-      <w:lang w:eastAsia="en-US"/>
     </w:rPr>
   </w:style>
   <w:style w:type="paragraph" w:styleId="Ttulo2">
@@ -3040,8 +6521,7 @@
     <w:pPr>
       <w:keepNext/>
       <w:keepLines/>
-      <w:spacing w:before="160" w:after="80" w:line="278" w:lineRule="auto"/>
-      <w:ind w:left="0" w:firstLine="0"/>
+      <w:spacing w:before="160" w:after="80"/>
       <w:outlineLvl w:val="1"/>
     </w:pPr>
     <w:rPr>
@@ -3049,7 +6529,6 @@
       <w:color w:val="0F4761" w:themeColor="accent1" w:themeShade="BF"/>
       <w:sz w:val="32"/>
       <w:szCs w:val="32"/>
-      <w:lang w:eastAsia="en-US"/>
     </w:rPr>
   </w:style>
   <w:style w:type="paragraph" w:styleId="Ttulo3">
@@ -3065,16 +6544,14 @@
     <w:pPr>
       <w:keepNext/>
       <w:keepLines/>
-      <w:spacing w:before="160" w:after="80" w:line="278" w:lineRule="auto"/>
-      <w:ind w:left="0" w:firstLine="0"/>
+      <w:spacing w:before="160" w:after="80"/>
       <w:outlineLvl w:val="2"/>
     </w:pPr>
     <w:rPr>
-      <w:rFonts w:asciiTheme="minorHAnsi" w:eastAsiaTheme="majorEastAsia" w:hAnsiTheme="minorHAnsi" w:cstheme="majorBidi"/>
+      <w:rFonts w:eastAsiaTheme="majorEastAsia" w:cstheme="majorBidi"/>
       <w:color w:val="0F4761" w:themeColor="accent1" w:themeShade="BF"/>
       <w:sz w:val="28"/>
       <w:szCs w:val="28"/>
-      <w:lang w:eastAsia="en-US"/>
     </w:rPr>
   </w:style>
   <w:style w:type="paragraph" w:styleId="Ttulo4">
@@ -3090,17 +6567,14 @@
     <w:pPr>
       <w:keepNext/>
       <w:keepLines/>
-      <w:spacing w:before="80" w:after="40" w:line="278" w:lineRule="auto"/>
-      <w:ind w:left="0" w:firstLine="0"/>
+      <w:spacing w:before="80" w:after="40"/>
       <w:outlineLvl w:val="3"/>
     </w:pPr>
     <w:rPr>
-      <w:rFonts w:asciiTheme="minorHAnsi" w:eastAsiaTheme="majorEastAsia" w:hAnsiTheme="minorHAnsi" w:cstheme="majorBidi"/>
+      <w:rFonts w:eastAsiaTheme="majorEastAsia" w:cstheme="majorBidi"/>
       <w:i/>
       <w:iCs/>
       <w:color w:val="0F4761" w:themeColor="accent1" w:themeShade="BF"/>
-      <w:sz w:val="24"/>
-      <w:lang w:eastAsia="en-US"/>
     </w:rPr>
   </w:style>
   <w:style w:type="paragraph" w:styleId="Ttulo5">
@@ -3116,15 +6590,12 @@
     <w:pPr>
       <w:keepNext/>
       <w:keepLines/>
-      <w:spacing w:before="80" w:after="40" w:line="278" w:lineRule="auto"/>
-      <w:ind w:left="0" w:firstLine="0"/>
+      <w:spacing w:before="80" w:after="40"/>
       <w:outlineLvl w:val="4"/>
     </w:pPr>
     <w:rPr>
-      <w:rFonts w:asciiTheme="minorHAnsi" w:eastAsiaTheme="majorEastAsia" w:hAnsiTheme="minorHAnsi" w:cstheme="majorBidi"/>
+      <w:rFonts w:eastAsiaTheme="majorEastAsia" w:cstheme="majorBidi"/>
       <w:color w:val="0F4761" w:themeColor="accent1" w:themeShade="BF"/>
-      <w:sz w:val="24"/>
-      <w:lang w:eastAsia="en-US"/>
     </w:rPr>
   </w:style>
   <w:style w:type="paragraph" w:styleId="Ttulo6">
@@ -3140,17 +6611,14 @@
     <w:pPr>
       <w:keepNext/>
       <w:keepLines/>
-      <w:spacing w:before="40" w:after="0" w:line="278" w:lineRule="auto"/>
-      <w:ind w:left="0" w:firstLine="0"/>
+      <w:spacing w:before="40" w:after="0"/>
       <w:outlineLvl w:val="5"/>
     </w:pPr>
     <w:rPr>
-      <w:rFonts w:asciiTheme="minorHAnsi" w:eastAsiaTheme="majorEastAsia" w:hAnsiTheme="minorHAnsi" w:cstheme="majorBidi"/>
+      <w:rFonts w:eastAsiaTheme="majorEastAsia" w:cstheme="majorBidi"/>
       <w:i/>
       <w:iCs/>
       <w:color w:val="595959" w:themeColor="text1" w:themeTint="A6"/>
-      <w:sz w:val="24"/>
-      <w:lang w:eastAsia="en-US"/>
     </w:rPr>
   </w:style>
   <w:style w:type="paragraph" w:styleId="Ttulo7">
@@ -3166,15 +6634,12 @@
     <w:pPr>
       <w:keepNext/>
       <w:keepLines/>
-      <w:spacing w:before="40" w:after="0" w:line="278" w:lineRule="auto"/>
-      <w:ind w:left="0" w:firstLine="0"/>
+      <w:spacing w:before="40" w:after="0"/>
       <w:outlineLvl w:val="6"/>
     </w:pPr>
     <w:rPr>
-      <w:rFonts w:asciiTheme="minorHAnsi" w:eastAsiaTheme="majorEastAsia" w:hAnsiTheme="minorHAnsi" w:cstheme="majorBidi"/>
+      <w:rFonts w:eastAsiaTheme="majorEastAsia" w:cstheme="majorBidi"/>
       <w:color w:val="595959" w:themeColor="text1" w:themeTint="A6"/>
-      <w:sz w:val="24"/>
-      <w:lang w:eastAsia="en-US"/>
     </w:rPr>
   </w:style>
   <w:style w:type="paragraph" w:styleId="Ttulo8">
@@ -3190,17 +6655,14 @@
     <w:pPr>
       <w:keepNext/>
       <w:keepLines/>
-      <w:spacing w:after="0" w:line="278" w:lineRule="auto"/>
-      <w:ind w:left="0" w:firstLine="0"/>
+      <w:spacing w:after="0"/>
       <w:outlineLvl w:val="7"/>
     </w:pPr>
     <w:rPr>
-      <w:rFonts w:asciiTheme="minorHAnsi" w:eastAsiaTheme="majorEastAsia" w:hAnsiTheme="minorHAnsi" w:cstheme="majorBidi"/>
+      <w:rFonts w:eastAsiaTheme="majorEastAsia" w:cstheme="majorBidi"/>
       <w:i/>
       <w:iCs/>
       <w:color w:val="272727" w:themeColor="text1" w:themeTint="D8"/>
-      <w:sz w:val="24"/>
-      <w:lang w:eastAsia="en-US"/>
     </w:rPr>
   </w:style>
   <w:style w:type="paragraph" w:styleId="Ttulo9">
@@ -3216,15 +6678,12 @@
     <w:pPr>
       <w:keepNext/>
       <w:keepLines/>
-      <w:spacing w:after="0" w:line="278" w:lineRule="auto"/>
-      <w:ind w:left="0" w:firstLine="0"/>
+      <w:spacing w:after="0"/>
       <w:outlineLvl w:val="8"/>
     </w:pPr>
     <w:rPr>
-      <w:rFonts w:asciiTheme="minorHAnsi" w:eastAsiaTheme="majorEastAsia" w:hAnsiTheme="minorHAnsi" w:cstheme="majorBidi"/>
+      <w:rFonts w:eastAsiaTheme="majorEastAsia" w:cstheme="majorBidi"/>
       <w:color w:val="272727" w:themeColor="text1" w:themeTint="D8"/>
-      <w:sz w:val="24"/>
-      <w:lang w:eastAsia="en-US"/>
     </w:rPr>
   </w:style>
   <w:style w:type="character" w:default="1" w:styleId="Fuentedeprrafopredeter">
@@ -3382,17 +6841,14 @@
     <w:rsid w:val="00A625AB"/>
     <w:pPr>
       <w:spacing w:after="80" w:line="240" w:lineRule="auto"/>
-      <w:ind w:left="0" w:firstLine="0"/>
       <w:contextualSpacing/>
     </w:pPr>
     <w:rPr>
       <w:rFonts w:asciiTheme="majorHAnsi" w:eastAsiaTheme="majorEastAsia" w:hAnsiTheme="majorHAnsi" w:cstheme="majorBidi"/>
-      <w:color w:val="auto"/>
       <w:spacing w:val="-10"/>
       <w:kern w:val="28"/>
       <w:sz w:val="56"/>
       <w:szCs w:val="56"/>
-      <w:lang w:eastAsia="en-US"/>
     </w:rPr>
   </w:style>
   <w:style w:type="character" w:customStyle="1" w:styleId="TtuloCar">
@@ -3421,15 +6877,13 @@
       <w:numPr>
         <w:ilvl w:val="1"/>
       </w:numPr>
-      <w:spacing w:after="160" w:line="278" w:lineRule="auto"/>
     </w:pPr>
     <w:rPr>
-      <w:rFonts w:asciiTheme="minorHAnsi" w:eastAsiaTheme="majorEastAsia" w:hAnsiTheme="minorHAnsi" w:cstheme="majorBidi"/>
+      <w:rFonts w:eastAsiaTheme="majorEastAsia" w:cstheme="majorBidi"/>
       <w:color w:val="595959" w:themeColor="text1" w:themeTint="A6"/>
       <w:spacing w:val="15"/>
       <w:sz w:val="28"/>
       <w:szCs w:val="28"/>
-      <w:lang w:eastAsia="en-US"/>
     </w:rPr>
   </w:style>
   <w:style w:type="character" w:customStyle="1" w:styleId="SubttuloCar">
@@ -3455,17 +6909,13 @@
     <w:qFormat/>
     <w:rsid w:val="00A625AB"/>
     <w:pPr>
-      <w:spacing w:before="160" w:after="160" w:line="278" w:lineRule="auto"/>
-      <w:ind w:left="0" w:firstLine="0"/>
+      <w:spacing w:before="160"/>
       <w:jc w:val="center"/>
     </w:pPr>
     <w:rPr>
-      <w:rFonts w:asciiTheme="minorHAnsi" w:eastAsiaTheme="minorHAnsi" w:hAnsiTheme="minorHAnsi" w:cstheme="minorBidi"/>
       <w:i/>
       <w:iCs/>
       <w:color w:val="404040" w:themeColor="text1" w:themeTint="BF"/>
-      <w:sz w:val="24"/>
-      <w:lang w:eastAsia="en-US"/>
     </w:rPr>
   </w:style>
   <w:style w:type="character" w:customStyle="1" w:styleId="CitaCar">
@@ -3487,16 +6937,9 @@
     <w:qFormat/>
     <w:rsid w:val="00A625AB"/>
     <w:pPr>
-      <w:spacing w:after="160" w:line="278" w:lineRule="auto"/>
-      <w:ind w:left="720" w:firstLine="0"/>
+      <w:ind w:left="720"/>
       <w:contextualSpacing/>
     </w:pPr>
-    <w:rPr>
-      <w:rFonts w:asciiTheme="minorHAnsi" w:eastAsiaTheme="minorHAnsi" w:hAnsiTheme="minorHAnsi" w:cstheme="minorBidi"/>
-      <w:color w:val="auto"/>
-      <w:sz w:val="24"/>
-      <w:lang w:eastAsia="en-US"/>
-    </w:rPr>
   </w:style>
   <w:style w:type="character" w:styleId="nfasisintenso">
     <w:name w:val="Intense Emphasis"/>
@@ -3523,17 +6966,14 @@
         <w:top w:val="single" w:sz="4" w:space="10" w:color="0F4761" w:themeColor="accent1" w:themeShade="BF"/>
         <w:bottom w:val="single" w:sz="4" w:space="10" w:color="0F4761" w:themeColor="accent1" w:themeShade="BF"/>
       </w:pBdr>
-      <w:spacing w:before="360" w:after="360" w:line="278" w:lineRule="auto"/>
-      <w:ind w:left="864" w:right="864" w:firstLine="0"/>
+      <w:spacing w:before="360" w:after="360"/>
+      <w:ind w:left="864" w:right="864"/>
       <w:jc w:val="center"/>
     </w:pPr>
     <w:rPr>
-      <w:rFonts w:asciiTheme="minorHAnsi" w:eastAsiaTheme="minorHAnsi" w:hAnsiTheme="minorHAnsi" w:cstheme="minorBidi"/>
       <w:i/>
       <w:iCs/>
       <w:color w:val="0F4761" w:themeColor="accent1" w:themeShade="BF"/>
-      <w:sz w:val="24"/>
-      <w:lang w:eastAsia="en-US"/>
     </w:rPr>
   </w:style>
   <w:style w:type="character" w:customStyle="1" w:styleId="CitadestacadaCar">
@@ -3589,6 +7029,79 @@
       <w:sz w:val="22"/>
       <w:lang w:eastAsia="es-EC"/>
     </w:rPr>
+  </w:style>
+  <w:style w:type="paragraph" w:styleId="HTMLconformatoprevio">
+    <w:name w:val="HTML Preformatted"/>
+    <w:basedOn w:val="Normal"/>
+    <w:link w:val="HTMLconformatoprevioCar"/>
+    <w:uiPriority w:val="99"/>
+    <w:semiHidden/>
+    <w:unhideWhenUsed/>
+    <w:rsid w:val="00095DC4"/>
+    <w:pPr>
+      <w:tabs>
+        <w:tab w:val="left" w:pos="916"/>
+        <w:tab w:val="left" w:pos="1832"/>
+        <w:tab w:val="left" w:pos="2748"/>
+        <w:tab w:val="left" w:pos="3664"/>
+        <w:tab w:val="left" w:pos="4580"/>
+        <w:tab w:val="left" w:pos="5496"/>
+        <w:tab w:val="left" w:pos="6412"/>
+        <w:tab w:val="left" w:pos="7328"/>
+        <w:tab w:val="left" w:pos="8244"/>
+        <w:tab w:val="left" w:pos="9160"/>
+        <w:tab w:val="left" w:pos="10076"/>
+        <w:tab w:val="left" w:pos="10992"/>
+        <w:tab w:val="left" w:pos="11908"/>
+        <w:tab w:val="left" w:pos="12824"/>
+        <w:tab w:val="left" w:pos="13740"/>
+        <w:tab w:val="left" w:pos="14656"/>
+      </w:tabs>
+      <w:spacing w:after="0" w:line="240" w:lineRule="auto"/>
+      <w:ind w:left="0" w:firstLine="0"/>
+    </w:pPr>
+    <w:rPr>
+      <w:rFonts w:ascii="Courier New" w:eastAsia="Times New Roman" w:hAnsi="Courier New" w:cs="Courier New"/>
+      <w:color w:val="auto"/>
+      <w:kern w:val="0"/>
+      <w:sz w:val="20"/>
+      <w:szCs w:val="20"/>
+      <w14:ligatures w14:val="none"/>
+    </w:rPr>
+  </w:style>
+  <w:style w:type="character" w:customStyle="1" w:styleId="HTMLconformatoprevioCar">
+    <w:name w:val="HTML con formato previo Car"/>
+    <w:basedOn w:val="Fuentedeprrafopredeter"/>
+    <w:link w:val="HTMLconformatoprevio"/>
+    <w:uiPriority w:val="99"/>
+    <w:semiHidden/>
+    <w:rsid w:val="00095DC4"/>
+    <w:rPr>
+      <w:rFonts w:ascii="Courier New" w:eastAsia="Times New Roman" w:hAnsi="Courier New" w:cs="Courier New"/>
+      <w:kern w:val="0"/>
+      <w:sz w:val="20"/>
+      <w:szCs w:val="20"/>
+      <w:lang w:eastAsia="es-EC"/>
+      <w14:ligatures w14:val="none"/>
+    </w:rPr>
+  </w:style>
+  <w:style w:type="character" w:styleId="CdigoHTML">
+    <w:name w:val="HTML Code"/>
+    <w:basedOn w:val="Fuentedeprrafopredeter"/>
+    <w:uiPriority w:val="99"/>
+    <w:semiHidden/>
+    <w:unhideWhenUsed/>
+    <w:rsid w:val="00095DC4"/>
+    <w:rPr>
+      <w:rFonts w:ascii="Courier New" w:eastAsia="Times New Roman" w:hAnsi="Courier New" w:cs="Courier New"/>
+      <w:sz w:val="20"/>
+      <w:szCs w:val="20"/>
+    </w:rPr>
+  </w:style>
+  <w:style w:type="character" w:customStyle="1" w:styleId="hljs-number">
+    <w:name w:val="hljs-number"/>
+    <w:basedOn w:val="Fuentedeprrafopredeter"/>
+    <w:rsid w:val="00095DC4"/>
   </w:style>
 </w:styles>
 </file>

</xml_diff>